<commit_message>
new file:   Petri/UI-testing-on-lecture/screenshot_1792066045.png 	new file:   Petri/UI-testing-on-lecture/screenshot_1792066109.png 	new file:   Petri/UI-testing-on-lecture/screenshot_1792066325.png 	new file:   Petri/UI-testing-on-lecture/screenshot_1792066576.png 	new file:   Petri/UI-testing-on-lecture/screenshot_1792066666.png 	new file:   Petri/UI-testing-on-lecture/screenshot_1792067149.png 	new file:   Petri/UI-testing-on-lecture/screenshot_1792067279.png 	modified:   Petri/task-V-GUI-testing/LAB_Thesis_template_for_writing_thesis_reports_2026.docx 	new file:   Petri/task-V-GUI-testing/Screenshot 2026-10-28 095405.png 	new file:   Petri/task-V-GUI-testing/Task-V-WEB-GUI-testing.pdf 	modified:   Petri/task-V-GUI-testing/public/index.html
</commit_message>
<xml_diff>
--- a/Petri/task-V-GUI-testing/LAB_Thesis_template_for_writing_thesis_reports_2026.docx
+++ b/Petri/task-V-GUI-testing/LAB_Thesis_template_for_writing_thesis_reports_2026.docx
@@ -53,13 +53,7 @@
         <w:pStyle w:val="LABThesisTitle"/>
       </w:pPr>
       <w:r>
-        <w:t xml:space="preserve">Thesis </w:t>
-      </w:r>
-      <w:r>
-        <w:t>T</w:t>
-      </w:r>
-      <w:r>
-        <w:t>itle</w:t>
+        <w:t>Task-V</w:t>
       </w:r>
     </w:p>
     <w:p>
@@ -67,7 +61,7 @@
         <w:pStyle w:val="LABThesisSubtitle"/>
       </w:pPr>
       <w:r>
-        <w:t>Subheading, if any</w:t>
+        <w:t>WEB GUI testing</w:t>
       </w:r>
     </w:p>
     <w:p>
@@ -128,7 +122,7 @@
         <w:pStyle w:val="LABabstracttext"/>
       </w:pPr>
       <w:r>
-        <w:t>Type here your degree.</w:t>
+        <w:t>Bachelor of Engineering: Industrial Information Technology</w:t>
       </w:r>
     </w:p>
     <w:p>
@@ -136,10 +130,7 @@
         <w:pStyle w:val="LABabstracttext"/>
       </w:pPr>
       <w:r>
-        <w:t>Type here the graduation year.</w:t>
-      </w:r>
-      <w:r>
-        <w:t xml:space="preserve"> </w:t>
+        <w:t>2027</w:t>
       </w:r>
     </w:p>
     <w:p>
@@ -162,55 +153,7 @@
           <w:szCs w:val="20"/>
           <w:lang w:eastAsia="fi-FI"/>
         </w:rPr>
-        <w:t>Type here your F</w:t>
-      </w:r>
-      <w:r>
-        <w:rPr>
-          <w:rFonts w:ascii="Arial" w:eastAsia="Times New Roman" w:hAnsi="Arial" w:cs="Times New Roman"/>
-          <w:szCs w:val="20"/>
-          <w:lang w:eastAsia="fi-FI"/>
-        </w:rPr>
-        <w:t>irstname</w:t>
-      </w:r>
-      <w:r>
-        <w:rPr>
-          <w:rFonts w:ascii="Arial" w:eastAsia="Times New Roman" w:hAnsi="Arial" w:cs="Times New Roman"/>
-          <w:szCs w:val="20"/>
-          <w:lang w:eastAsia="fi-FI"/>
-        </w:rPr>
-        <w:t xml:space="preserve"> </w:t>
-      </w:r>
-      <w:r>
-        <w:rPr>
-          <w:rFonts w:ascii="Arial" w:eastAsia="Times New Roman" w:hAnsi="Arial" w:cs="Times New Roman"/>
-          <w:szCs w:val="20"/>
-          <w:lang w:eastAsia="fi-FI"/>
-        </w:rPr>
-        <w:t>and L</w:t>
-      </w:r>
-      <w:r>
-        <w:rPr>
-          <w:rFonts w:ascii="Arial" w:eastAsia="Times New Roman" w:hAnsi="Arial" w:cs="Times New Roman"/>
-          <w:szCs w:val="20"/>
-          <w:lang w:eastAsia="fi-FI"/>
-        </w:rPr>
-        <w:t>ast</w:t>
-      </w:r>
-      <w:r>
-        <w:rPr>
-          <w:rFonts w:ascii="Arial" w:eastAsia="Times New Roman" w:hAnsi="Arial" w:cs="Times New Roman"/>
-          <w:szCs w:val="20"/>
-          <w:lang w:eastAsia="fi-FI"/>
-        </w:rPr>
-        <w:t>name</w:t>
-      </w:r>
-      <w:r>
-        <w:rPr>
-          <w:rFonts w:ascii="Arial" w:eastAsia="Times New Roman" w:hAnsi="Arial" w:cs="Times New Roman"/>
-          <w:szCs w:val="20"/>
-          <w:lang w:eastAsia="fi-FI"/>
-        </w:rPr>
-        <w:t>.</w:t>
+        <w:t>Davin Pihlajasaari</w:t>
       </w:r>
     </w:p>
     <w:p>
@@ -237,7 +180,13 @@
         <w:pStyle w:val="LABnormal"/>
       </w:pPr>
       <w:r>
-        <w:t>The author of this thesis, Firstname Lastname, did not use any AI tools during the preparation of the thesis.</w:t>
+        <w:t xml:space="preserve">The author of this thesis, </w:t>
+      </w:r>
+      <w:r>
+        <w:t>Davin Pihaljasaari</w:t>
+      </w:r>
+      <w:r>
+        <w:t>, used the following AI tools during the preparation of the thesis:</w:t>
       </w:r>
     </w:p>
     <w:p>
@@ -245,7 +194,7 @@
         <w:pStyle w:val="LABnormal"/>
       </w:pPr>
       <w:r>
-        <w:t>OR</w:t>
+        <w:t>ChatGPT</w:t>
       </w:r>
     </w:p>
     <w:p>
@@ -253,7 +202,10 @@
         <w:pStyle w:val="LABnormal"/>
       </w:pPr>
       <w:r>
-        <w:t>The author of this thesis, Firstname Lastname, used the following AI tools during the preparation of the thesis:</w:t>
+        <w:t xml:space="preserve">Purpose of use: </w:t>
+      </w:r>
+      <w:r>
+        <w:t>used to make the WEB GUI for my converter function.</w:t>
       </w:r>
     </w:p>
     <w:p>
@@ -261,53 +213,22 @@
         <w:pStyle w:val="LABnormal"/>
       </w:pPr>
       <w:r>
-        <w:t>AI tool name A</w:t>
+        <w:t>Explanation of the use of the tool:</w:t>
+      </w:r>
+      <w:r>
+        <w:t xml:space="preserve"> I had ChatGPT generate a basic GUI that used my JavaScript function and had it </w:t>
+      </w:r>
+      <w:r>
+        <w:t>add</w:t>
+      </w:r>
+      <w:r>
+        <w:t xml:space="preserve"> comments after I was done modifying the files.</w:t>
       </w:r>
     </w:p>
     <w:p>
       <w:pPr>
         <w:pStyle w:val="LABnormal"/>
       </w:pPr>
-      <w:r>
-        <w:t xml:space="preserve">Purpose of use: </w:t>
-      </w:r>
-    </w:p>
-    <w:p>
-      <w:pPr>
-        <w:pStyle w:val="LABnormal"/>
-      </w:pPr>
-      <w:r>
-        <w:t>Explanation of the use of the tool:</w:t>
-      </w:r>
-    </w:p>
-    <w:p>
-      <w:pPr>
-        <w:pStyle w:val="LABnormal"/>
-      </w:pPr>
-    </w:p>
-    <w:p>
-      <w:pPr>
-        <w:pStyle w:val="LABnormal"/>
-      </w:pPr>
-      <w:r>
-        <w:t>AI tool name B</w:t>
-      </w:r>
-    </w:p>
-    <w:p>
-      <w:pPr>
-        <w:pStyle w:val="LABnormal"/>
-      </w:pPr>
-      <w:r>
-        <w:t xml:space="preserve">Purpose of use: </w:t>
-      </w:r>
-    </w:p>
-    <w:p>
-      <w:pPr>
-        <w:pStyle w:val="LABnormal"/>
-      </w:pPr>
-      <w:r>
-        <w:t>Explanation of the use of the tool:</w:t>
-      </w:r>
     </w:p>
     <w:p>
       <w:pPr>
@@ -353,7 +274,21 @@
           <w:rFonts w:ascii="Arial" w:hAnsi="Arial" w:cs="Arial"/>
           <w:lang w:val="en-US"/>
         </w:rPr>
-        <w:t xml:space="preserve">The author of this thesis, Firstname Lastname, takes full responsibility for the content of this thesis and has reviewed and edited the content generated by the possible use of AI tools. The author has saved all discussions with AI applications during the thesis process. Thus, the extent of the author’s own work and the use of AI can be verified if necessary. </w:t>
+        <w:t xml:space="preserve">The author of this thesis, </w:t>
+      </w:r>
+      <w:r>
+        <w:rPr>
+          <w:rFonts w:ascii="Arial" w:hAnsi="Arial" w:cs="Arial"/>
+          <w:lang w:val="en-US"/>
+        </w:rPr>
+        <w:t>Davin Pihlajasaari</w:t>
+      </w:r>
+      <w:r>
+        <w:rPr>
+          <w:rFonts w:ascii="Arial" w:hAnsi="Arial" w:cs="Arial"/>
+          <w:lang w:val="en-US"/>
+        </w:rPr>
+        <w:t xml:space="preserve">, takes full responsibility for the content of this thesis and has reviewed and edited the content generated by the possible use of AI tools. The author has saved all discussions with AI applications during the thesis process. Thus, the extent of the author’s own work and the use of AI can be verified if necessary. </w:t>
       </w:r>
     </w:p>
     <w:p>
@@ -491,7 +426,7 @@
               <w:rPr>
                 <w:rFonts w:cs="Arial"/>
               </w:rPr>
-              <w:t>Firstname Lastname</w:t>
+              <w:t>Davin Pihlajasaari</w:t>
             </w:r>
           </w:p>
         </w:tc>
@@ -532,7 +467,7 @@
               <w:rPr>
                 <w:rFonts w:cs="Arial"/>
               </w:rPr>
-              <w:t>Thesis, UAS</w:t>
+              <w:t>Report</w:t>
             </w:r>
           </w:p>
         </w:tc>
@@ -567,7 +502,13 @@
               <w:rPr>
                 <w:rFonts w:cs="Arial"/>
               </w:rPr>
-              <w:t>20xx</w:t>
+              <w:t>20</w:t>
+            </w:r>
+            <w:r>
+              <w:rPr>
+                <w:rFonts w:cs="Arial"/>
+              </w:rPr>
+              <w:t>26</w:t>
             </w:r>
           </w:p>
         </w:tc>
@@ -617,7 +558,7 @@
               <w:rPr>
                 <w:rFonts w:ascii="Arial" w:hAnsi="Arial" w:cs="Arial"/>
               </w:rPr>
-              <w:t>xx</w:t>
+              <w:t>8</w:t>
             </w:r>
           </w:p>
         </w:tc>
@@ -680,25 +621,7 @@
               <w:rPr>
                 <w:b/>
               </w:rPr>
-              <w:t xml:space="preserve">Title of </w:t>
-            </w:r>
-            <w:r>
-              <w:rPr>
-                <w:b/>
-              </w:rPr>
-              <w:t xml:space="preserve">the </w:t>
-            </w:r>
-            <w:r>
-              <w:rPr>
-                <w:b/>
-              </w:rPr>
-              <w:t>T</w:t>
-            </w:r>
-            <w:r>
-              <w:rPr>
-                <w:b/>
-              </w:rPr>
-              <w:t>hesis</w:t>
+              <w:t>Task-V</w:t>
             </w:r>
           </w:p>
           <w:p>
@@ -709,7 +632,7 @@
               </w:rPr>
             </w:pPr>
             <w:r>
-              <w:t>Subheading, if any</w:t>
+              <w:t>WEB GUI testing</w:t>
             </w:r>
           </w:p>
         </w:tc>
@@ -747,6 +670,9 @@
             <w:pPr>
               <w:pStyle w:val="LABabstracttext"/>
             </w:pPr>
+            <w:r>
+              <w:t>Bachelor of Engineering: Industrial Information Technology</w:t>
+            </w:r>
           </w:p>
         </w:tc>
       </w:tr>
@@ -798,6 +724,9 @@
             <w:pPr>
               <w:pStyle w:val="LABabstracttext"/>
             </w:pPr>
+            <w:r>
+              <w:t>Petri Rantanen</w:t>
+            </w:r>
           </w:p>
         </w:tc>
       </w:tr>
@@ -829,7 +758,7 @@
               <w:pStyle w:val="LABabstracttext"/>
             </w:pPr>
             <w:r>
-              <w:t>Type the abstract text here …</w:t>
+              <w:t>A report on WEB GUI testing using both manual and automatic means.</w:t>
             </w:r>
           </w:p>
         </w:tc>
@@ -858,14 +787,10 @@
             </w:r>
           </w:p>
           <w:p>
-            <w:pPr>
-              <w:pStyle w:val="LABabstracttext"/>
-            </w:pPr>
-            <w:r>
-              <w:t>keyword, keyword, keyword</w:t>
+            <w:r>
+              <w:t xml:space="preserve">WEB DEV. UI. GUI, testing, </w:t>
             </w:r>
           </w:p>
-          <w:p/>
           <w:p>
             <w:pPr>
               <w:tabs>
@@ -938,7 +863,7 @@
               <w:kern w:val="2"/>
               <w:sz w:val="24"/>
               <w:szCs w:val="24"/>
-              <w:lang w:val="fi-FI" w:eastAsia="zh-CN"/>
+              <w:lang/>
               <w14:ligatures w14:val="standardContextual"/>
             </w:rPr>
           </w:pPr>
@@ -960,7 +885,7 @@
             </w:rPr>
             <w:fldChar w:fldCharType="separate"/>
           </w:r>
-          <w:hyperlink w:anchor="_Toc226987096" w:history="1">
+          <w:hyperlink w:anchor="_Toc244092268" w:history="1">
             <w:r>
               <w:rPr>
                 <w:rStyle w:val="Hyperlink"/>
@@ -973,7 +898,7 @@
                 <w:kern w:val="2"/>
                 <w:sz w:val="24"/>
                 <w:szCs w:val="24"/>
-                <w:lang w:val="fi-FI" w:eastAsia="zh-CN"/>
+                <w:lang/>
                 <w14:ligatures w14:val="standardContextual"/>
               </w:rPr>
               <w:tab/>
@@ -982,7 +907,7 @@
               <w:rPr>
                 <w:rStyle w:val="Hyperlink"/>
               </w:rPr>
-              <w:t>Introduction</w:t>
+              <w:t>Tests used</w:t>
             </w:r>
             <w:r>
               <w:rPr>
@@ -1000,7 +925,7 @@
               <w:rPr>
                 <w:webHidden/>
               </w:rPr>
-              <w:instrText xml:space="preserve"> PAGEREF _Toc226987096 \h </w:instrText>
+              <w:instrText xml:space="preserve"> PAGEREF _Toc244092268 \h </w:instrText>
             </w:r>
             <w:r>
               <w:rPr>
@@ -1035,11 +960,11 @@
               <w:kern w:val="2"/>
               <w:sz w:val="24"/>
               <w:szCs w:val="24"/>
-              <w:lang w:val="fi-FI" w:eastAsia="zh-CN"/>
+              <w:lang/>
               <w14:ligatures w14:val="standardContextual"/>
             </w:rPr>
           </w:pPr>
-          <w:hyperlink w:anchor="_Toc226987097" w:history="1">
+          <w:hyperlink w:anchor="_Toc244092269" w:history="1">
             <w:r>
               <w:rPr>
                 <w:rStyle w:val="Hyperlink"/>
@@ -1052,7 +977,7 @@
                 <w:kern w:val="2"/>
                 <w:sz w:val="24"/>
                 <w:szCs w:val="24"/>
-                <w:lang w:val="fi-FI" w:eastAsia="zh-CN"/>
+                <w:lang/>
                 <w14:ligatures w14:val="standardContextual"/>
               </w:rPr>
               <w:tab/>
@@ -1061,7 +986,7 @@
               <w:rPr>
                 <w:rStyle w:val="Hyperlink"/>
               </w:rPr>
-              <w:t>Second main section</w:t>
+              <w:t>Advantages and disadvantages</w:t>
             </w:r>
             <w:r>
               <w:rPr>
@@ -1079,7 +1004,7 @@
               <w:rPr>
                 <w:webHidden/>
               </w:rPr>
-              <w:instrText xml:space="preserve"> PAGEREF _Toc226987097 \h </w:instrText>
+              <w:instrText xml:space="preserve"> PAGEREF _Toc244092269 \h </w:instrText>
             </w:r>
             <w:r>
               <w:rPr>
@@ -1100,382 +1025,6 @@
             </w:r>
             <w:r>
               <w:rPr>
-                <w:webHidden/>
-              </w:rPr>
-              <w:fldChar w:fldCharType="end"/>
-            </w:r>
-          </w:hyperlink>
-        </w:p>
-        <w:p>
-          <w:pPr>
-            <w:pStyle w:val="TOC2"/>
-            <w:tabs>
-              <w:tab w:val="left" w:pos="960"/>
-              <w:tab w:val="right" w:leader="dot" w:pos="8777"/>
-            </w:tabs>
-            <w:rPr>
-              <w:rFonts w:asciiTheme="minorHAnsi" w:eastAsiaTheme="minorEastAsia" w:hAnsiTheme="minorHAnsi"/>
-              <w:noProof/>
-              <w:kern w:val="2"/>
-              <w:sz w:val="24"/>
-              <w:szCs w:val="24"/>
-              <w:lang w:val="fi-FI" w:eastAsia="zh-CN"/>
-              <w14:ligatures w14:val="standardContextual"/>
-            </w:rPr>
-          </w:pPr>
-          <w:hyperlink w:anchor="_Toc226987098" w:history="1">
-            <w:r>
-              <w:rPr>
-                <w:rStyle w:val="Hyperlink"/>
-                <w:noProof/>
-              </w:rPr>
-              <w:t>2.1</w:t>
-            </w:r>
-            <w:r>
-              <w:rPr>
-                <w:rFonts w:asciiTheme="minorHAnsi" w:eastAsiaTheme="minorEastAsia" w:hAnsiTheme="minorHAnsi"/>
-                <w:noProof/>
-                <w:kern w:val="2"/>
-                <w:sz w:val="24"/>
-                <w:szCs w:val="24"/>
-                <w:lang w:val="fi-FI" w:eastAsia="zh-CN"/>
-                <w14:ligatures w14:val="standardContextual"/>
-              </w:rPr>
-              <w:tab/>
-            </w:r>
-            <w:r>
-              <w:rPr>
-                <w:rStyle w:val="Hyperlink"/>
-                <w:noProof/>
-              </w:rPr>
-              <w:t>First subsection</w:t>
-            </w:r>
-            <w:r>
-              <w:rPr>
-                <w:noProof/>
-                <w:webHidden/>
-              </w:rPr>
-              <w:tab/>
-            </w:r>
-            <w:r>
-              <w:rPr>
-                <w:noProof/>
-                <w:webHidden/>
-              </w:rPr>
-              <w:fldChar w:fldCharType="begin"/>
-            </w:r>
-            <w:r>
-              <w:rPr>
-                <w:noProof/>
-                <w:webHidden/>
-              </w:rPr>
-              <w:instrText xml:space="preserve"> PAGEREF _Toc226987098 \h </w:instrText>
-            </w:r>
-            <w:r>
-              <w:rPr>
-                <w:noProof/>
-                <w:webHidden/>
-              </w:rPr>
-            </w:r>
-            <w:r>
-              <w:rPr>
-                <w:noProof/>
-                <w:webHidden/>
-              </w:rPr>
-              <w:fldChar w:fldCharType="separate"/>
-            </w:r>
-            <w:r>
-              <w:rPr>
-                <w:noProof/>
-                <w:webHidden/>
-              </w:rPr>
-              <w:t>2</w:t>
-            </w:r>
-            <w:r>
-              <w:rPr>
-                <w:noProof/>
-                <w:webHidden/>
-              </w:rPr>
-              <w:fldChar w:fldCharType="end"/>
-            </w:r>
-          </w:hyperlink>
-        </w:p>
-        <w:p>
-          <w:pPr>
-            <w:pStyle w:val="TOC3"/>
-            <w:tabs>
-              <w:tab w:val="left" w:pos="1200"/>
-              <w:tab w:val="right" w:leader="dot" w:pos="8777"/>
-            </w:tabs>
-            <w:rPr>
-              <w:rFonts w:asciiTheme="minorHAnsi" w:eastAsiaTheme="minorEastAsia" w:hAnsiTheme="minorHAnsi"/>
-              <w:noProof/>
-              <w:kern w:val="2"/>
-              <w:sz w:val="24"/>
-              <w:szCs w:val="24"/>
-              <w:lang w:val="fi-FI" w:eastAsia="zh-CN"/>
-              <w14:ligatures w14:val="standardContextual"/>
-            </w:rPr>
-          </w:pPr>
-          <w:hyperlink w:anchor="_Toc226987099" w:history="1">
-            <w:r>
-              <w:rPr>
-                <w:rStyle w:val="Hyperlink"/>
-                <w:noProof/>
-              </w:rPr>
-              <w:t>2.1.1</w:t>
-            </w:r>
-            <w:r>
-              <w:rPr>
-                <w:rFonts w:asciiTheme="minorHAnsi" w:eastAsiaTheme="minorEastAsia" w:hAnsiTheme="minorHAnsi"/>
-                <w:noProof/>
-                <w:kern w:val="2"/>
-                <w:sz w:val="24"/>
-                <w:szCs w:val="24"/>
-                <w:lang w:val="fi-FI" w:eastAsia="zh-CN"/>
-                <w14:ligatures w14:val="standardContextual"/>
-              </w:rPr>
-              <w:tab/>
-            </w:r>
-            <w:r>
-              <w:rPr>
-                <w:rStyle w:val="Hyperlink"/>
-                <w:noProof/>
-              </w:rPr>
-              <w:t>Subsection of first subsection</w:t>
-            </w:r>
-            <w:r>
-              <w:rPr>
-                <w:noProof/>
-                <w:webHidden/>
-              </w:rPr>
-              <w:tab/>
-            </w:r>
-            <w:r>
-              <w:rPr>
-                <w:noProof/>
-                <w:webHidden/>
-              </w:rPr>
-              <w:fldChar w:fldCharType="begin"/>
-            </w:r>
-            <w:r>
-              <w:rPr>
-                <w:noProof/>
-                <w:webHidden/>
-              </w:rPr>
-              <w:instrText xml:space="preserve"> PAGEREF _Toc226987099 \h </w:instrText>
-            </w:r>
-            <w:r>
-              <w:rPr>
-                <w:noProof/>
-                <w:webHidden/>
-              </w:rPr>
-            </w:r>
-            <w:r>
-              <w:rPr>
-                <w:noProof/>
-                <w:webHidden/>
-              </w:rPr>
-              <w:fldChar w:fldCharType="separate"/>
-            </w:r>
-            <w:r>
-              <w:rPr>
-                <w:noProof/>
-                <w:webHidden/>
-              </w:rPr>
-              <w:t>2</w:t>
-            </w:r>
-            <w:r>
-              <w:rPr>
-                <w:noProof/>
-                <w:webHidden/>
-              </w:rPr>
-              <w:fldChar w:fldCharType="end"/>
-            </w:r>
-          </w:hyperlink>
-        </w:p>
-        <w:p>
-          <w:pPr>
-            <w:pStyle w:val="TOC3"/>
-            <w:tabs>
-              <w:tab w:val="left" w:pos="1200"/>
-              <w:tab w:val="right" w:leader="dot" w:pos="8777"/>
-            </w:tabs>
-            <w:rPr>
-              <w:rFonts w:asciiTheme="minorHAnsi" w:eastAsiaTheme="minorEastAsia" w:hAnsiTheme="minorHAnsi"/>
-              <w:noProof/>
-              <w:kern w:val="2"/>
-              <w:sz w:val="24"/>
-              <w:szCs w:val="24"/>
-              <w:lang w:val="fi-FI" w:eastAsia="zh-CN"/>
-              <w14:ligatures w14:val="standardContextual"/>
-            </w:rPr>
-          </w:pPr>
-          <w:hyperlink w:anchor="_Toc226987100" w:history="1">
-            <w:r>
-              <w:rPr>
-                <w:rStyle w:val="Hyperlink"/>
-                <w:noProof/>
-              </w:rPr>
-              <w:t>2.1.2</w:t>
-            </w:r>
-            <w:r>
-              <w:rPr>
-                <w:rFonts w:asciiTheme="minorHAnsi" w:eastAsiaTheme="minorEastAsia" w:hAnsiTheme="minorHAnsi"/>
-                <w:noProof/>
-                <w:kern w:val="2"/>
-                <w:sz w:val="24"/>
-                <w:szCs w:val="24"/>
-                <w:lang w:val="fi-FI" w:eastAsia="zh-CN"/>
-                <w14:ligatures w14:val="standardContextual"/>
-              </w:rPr>
-              <w:tab/>
-            </w:r>
-            <w:r>
-              <w:rPr>
-                <w:rStyle w:val="Hyperlink"/>
-                <w:noProof/>
-              </w:rPr>
-              <w:t>Second subsection of subsection</w:t>
-            </w:r>
-            <w:r>
-              <w:rPr>
-                <w:noProof/>
-                <w:webHidden/>
-              </w:rPr>
-              <w:tab/>
-            </w:r>
-            <w:r>
-              <w:rPr>
-                <w:noProof/>
-                <w:webHidden/>
-              </w:rPr>
-              <w:fldChar w:fldCharType="begin"/>
-            </w:r>
-            <w:r>
-              <w:rPr>
-                <w:noProof/>
-                <w:webHidden/>
-              </w:rPr>
-              <w:instrText xml:space="preserve"> PAGEREF _Toc226987100 \h </w:instrText>
-            </w:r>
-            <w:r>
-              <w:rPr>
-                <w:noProof/>
-                <w:webHidden/>
-              </w:rPr>
-            </w:r>
-            <w:r>
-              <w:rPr>
-                <w:noProof/>
-                <w:webHidden/>
-              </w:rPr>
-              <w:fldChar w:fldCharType="separate"/>
-            </w:r>
-            <w:r>
-              <w:rPr>
-                <w:noProof/>
-                <w:webHidden/>
-              </w:rPr>
-              <w:t>2</w:t>
-            </w:r>
-            <w:r>
-              <w:rPr>
-                <w:noProof/>
-                <w:webHidden/>
-              </w:rPr>
-              <w:fldChar w:fldCharType="end"/>
-            </w:r>
-          </w:hyperlink>
-        </w:p>
-        <w:p>
-          <w:pPr>
-            <w:pStyle w:val="TOC2"/>
-            <w:tabs>
-              <w:tab w:val="left" w:pos="960"/>
-              <w:tab w:val="right" w:leader="dot" w:pos="8777"/>
-            </w:tabs>
-            <w:rPr>
-              <w:rFonts w:asciiTheme="minorHAnsi" w:eastAsiaTheme="minorEastAsia" w:hAnsiTheme="minorHAnsi"/>
-              <w:noProof/>
-              <w:kern w:val="2"/>
-              <w:sz w:val="24"/>
-              <w:szCs w:val="24"/>
-              <w:lang w:val="fi-FI" w:eastAsia="zh-CN"/>
-              <w14:ligatures w14:val="standardContextual"/>
-            </w:rPr>
-          </w:pPr>
-          <w:hyperlink w:anchor="_Toc226987101" w:history="1">
-            <w:r>
-              <w:rPr>
-                <w:rStyle w:val="Hyperlink"/>
-                <w:noProof/>
-              </w:rPr>
-              <w:t>2.2</w:t>
-            </w:r>
-            <w:r>
-              <w:rPr>
-                <w:rFonts w:asciiTheme="minorHAnsi" w:eastAsiaTheme="minorEastAsia" w:hAnsiTheme="minorHAnsi"/>
-                <w:noProof/>
-                <w:kern w:val="2"/>
-                <w:sz w:val="24"/>
-                <w:szCs w:val="24"/>
-                <w:lang w:val="fi-FI" w:eastAsia="zh-CN"/>
-                <w14:ligatures w14:val="standardContextual"/>
-              </w:rPr>
-              <w:tab/>
-            </w:r>
-            <w:r>
-              <w:rPr>
-                <w:rStyle w:val="Hyperlink"/>
-                <w:noProof/>
-              </w:rPr>
-              <w:t>Second subsection</w:t>
-            </w:r>
-            <w:r>
-              <w:rPr>
-                <w:noProof/>
-                <w:webHidden/>
-              </w:rPr>
-              <w:tab/>
-            </w:r>
-            <w:r>
-              <w:rPr>
-                <w:noProof/>
-                <w:webHidden/>
-              </w:rPr>
-              <w:fldChar w:fldCharType="begin"/>
-            </w:r>
-            <w:r>
-              <w:rPr>
-                <w:noProof/>
-                <w:webHidden/>
-              </w:rPr>
-              <w:instrText xml:space="preserve"> PAGEREF _Toc226987101 \h </w:instrText>
-            </w:r>
-            <w:r>
-              <w:rPr>
-                <w:noProof/>
-                <w:webHidden/>
-              </w:rPr>
-            </w:r>
-            <w:r>
-              <w:rPr>
-                <w:noProof/>
-                <w:webHidden/>
-              </w:rPr>
-              <w:fldChar w:fldCharType="separate"/>
-            </w:r>
-            <w:r>
-              <w:rPr>
-                <w:noProof/>
-                <w:webHidden/>
-              </w:rPr>
-              <w:t>2</w:t>
-            </w:r>
-            <w:r>
-              <w:rPr>
-                <w:noProof/>
                 <w:webHidden/>
               </w:rPr>
               <w:fldChar w:fldCharType="end"/>
@@ -1490,11 +1039,11 @@
               <w:kern w:val="2"/>
               <w:sz w:val="24"/>
               <w:szCs w:val="24"/>
-              <w:lang w:val="fi-FI" w:eastAsia="zh-CN"/>
+              <w:lang/>
               <w14:ligatures w14:val="standardContextual"/>
             </w:rPr>
           </w:pPr>
-          <w:hyperlink w:anchor="_Toc226987102" w:history="1">
+          <w:hyperlink w:anchor="_Toc244092270" w:history="1">
             <w:r>
               <w:rPr>
                 <w:rStyle w:val="Hyperlink"/>
@@ -1507,7 +1056,7 @@
                 <w:kern w:val="2"/>
                 <w:sz w:val="24"/>
                 <w:szCs w:val="24"/>
-                <w:lang w:val="fi-FI" w:eastAsia="zh-CN"/>
+                <w:lang/>
                 <w14:ligatures w14:val="standardContextual"/>
               </w:rPr>
               <w:tab/>
@@ -1516,7 +1065,7 @@
               <w:rPr>
                 <w:rStyle w:val="Hyperlink"/>
               </w:rPr>
-              <w:t>Third main section</w:t>
+              <w:t>Unimplemented alternatives</w:t>
             </w:r>
             <w:r>
               <w:rPr>
@@ -1534,7 +1083,7 @@
               <w:rPr>
                 <w:webHidden/>
               </w:rPr>
-              <w:instrText xml:space="preserve"> PAGEREF _Toc226987102 \h </w:instrText>
+              <w:instrText xml:space="preserve"> PAGEREF _Toc244092270 \h </w:instrText>
             </w:r>
             <w:r>
               <w:rPr>
@@ -1555,194 +1104,6 @@
             </w:r>
             <w:r>
               <w:rPr>
-                <w:webHidden/>
-              </w:rPr>
-              <w:fldChar w:fldCharType="end"/>
-            </w:r>
-          </w:hyperlink>
-        </w:p>
-        <w:p>
-          <w:pPr>
-            <w:pStyle w:val="TOC2"/>
-            <w:tabs>
-              <w:tab w:val="left" w:pos="960"/>
-              <w:tab w:val="right" w:leader="dot" w:pos="8777"/>
-            </w:tabs>
-            <w:rPr>
-              <w:rFonts w:asciiTheme="minorHAnsi" w:eastAsiaTheme="minorEastAsia" w:hAnsiTheme="minorHAnsi"/>
-              <w:noProof/>
-              <w:kern w:val="2"/>
-              <w:sz w:val="24"/>
-              <w:szCs w:val="24"/>
-              <w:lang w:val="fi-FI" w:eastAsia="zh-CN"/>
-              <w14:ligatures w14:val="standardContextual"/>
-            </w:rPr>
-          </w:pPr>
-          <w:hyperlink w:anchor="_Toc226987103" w:history="1">
-            <w:r>
-              <w:rPr>
-                <w:rStyle w:val="Hyperlink"/>
-                <w:noProof/>
-              </w:rPr>
-              <w:t>3.1</w:t>
-            </w:r>
-            <w:r>
-              <w:rPr>
-                <w:rFonts w:asciiTheme="minorHAnsi" w:eastAsiaTheme="minorEastAsia" w:hAnsiTheme="minorHAnsi"/>
-                <w:noProof/>
-                <w:kern w:val="2"/>
-                <w:sz w:val="24"/>
-                <w:szCs w:val="24"/>
-                <w:lang w:val="fi-FI" w:eastAsia="zh-CN"/>
-                <w14:ligatures w14:val="standardContextual"/>
-              </w:rPr>
-              <w:tab/>
-            </w:r>
-            <w:r>
-              <w:rPr>
-                <w:rStyle w:val="Hyperlink"/>
-                <w:noProof/>
-              </w:rPr>
-              <w:t>First subsection</w:t>
-            </w:r>
-            <w:r>
-              <w:rPr>
-                <w:noProof/>
-                <w:webHidden/>
-              </w:rPr>
-              <w:tab/>
-            </w:r>
-            <w:r>
-              <w:rPr>
-                <w:noProof/>
-                <w:webHidden/>
-              </w:rPr>
-              <w:fldChar w:fldCharType="begin"/>
-            </w:r>
-            <w:r>
-              <w:rPr>
-                <w:noProof/>
-                <w:webHidden/>
-              </w:rPr>
-              <w:instrText xml:space="preserve"> PAGEREF _Toc226987103 \h </w:instrText>
-            </w:r>
-            <w:r>
-              <w:rPr>
-                <w:noProof/>
-                <w:webHidden/>
-              </w:rPr>
-            </w:r>
-            <w:r>
-              <w:rPr>
-                <w:noProof/>
-                <w:webHidden/>
-              </w:rPr>
-              <w:fldChar w:fldCharType="separate"/>
-            </w:r>
-            <w:r>
-              <w:rPr>
-                <w:noProof/>
-                <w:webHidden/>
-              </w:rPr>
-              <w:t>3</w:t>
-            </w:r>
-            <w:r>
-              <w:rPr>
-                <w:noProof/>
-                <w:webHidden/>
-              </w:rPr>
-              <w:fldChar w:fldCharType="end"/>
-            </w:r>
-          </w:hyperlink>
-        </w:p>
-        <w:p>
-          <w:pPr>
-            <w:pStyle w:val="TOC2"/>
-            <w:tabs>
-              <w:tab w:val="left" w:pos="960"/>
-              <w:tab w:val="right" w:leader="dot" w:pos="8777"/>
-            </w:tabs>
-            <w:rPr>
-              <w:rFonts w:asciiTheme="minorHAnsi" w:eastAsiaTheme="minorEastAsia" w:hAnsiTheme="minorHAnsi"/>
-              <w:noProof/>
-              <w:kern w:val="2"/>
-              <w:sz w:val="24"/>
-              <w:szCs w:val="24"/>
-              <w:lang w:val="fi-FI" w:eastAsia="zh-CN"/>
-              <w14:ligatures w14:val="standardContextual"/>
-            </w:rPr>
-          </w:pPr>
-          <w:hyperlink w:anchor="_Toc226987104" w:history="1">
-            <w:r>
-              <w:rPr>
-                <w:rStyle w:val="Hyperlink"/>
-                <w:noProof/>
-              </w:rPr>
-              <w:t>3.2</w:t>
-            </w:r>
-            <w:r>
-              <w:rPr>
-                <w:rFonts w:asciiTheme="minorHAnsi" w:eastAsiaTheme="minorEastAsia" w:hAnsiTheme="minorHAnsi"/>
-                <w:noProof/>
-                <w:kern w:val="2"/>
-                <w:sz w:val="24"/>
-                <w:szCs w:val="24"/>
-                <w:lang w:val="fi-FI" w:eastAsia="zh-CN"/>
-                <w14:ligatures w14:val="standardContextual"/>
-              </w:rPr>
-              <w:tab/>
-            </w:r>
-            <w:r>
-              <w:rPr>
-                <w:rStyle w:val="Hyperlink"/>
-                <w:noProof/>
-              </w:rPr>
-              <w:t>Second subsection</w:t>
-            </w:r>
-            <w:r>
-              <w:rPr>
-                <w:noProof/>
-                <w:webHidden/>
-              </w:rPr>
-              <w:tab/>
-            </w:r>
-            <w:r>
-              <w:rPr>
-                <w:noProof/>
-                <w:webHidden/>
-              </w:rPr>
-              <w:fldChar w:fldCharType="begin"/>
-            </w:r>
-            <w:r>
-              <w:rPr>
-                <w:noProof/>
-                <w:webHidden/>
-              </w:rPr>
-              <w:instrText xml:space="preserve"> PAGEREF _Toc226987104 \h </w:instrText>
-            </w:r>
-            <w:r>
-              <w:rPr>
-                <w:noProof/>
-                <w:webHidden/>
-              </w:rPr>
-            </w:r>
-            <w:r>
-              <w:rPr>
-                <w:noProof/>
-                <w:webHidden/>
-              </w:rPr>
-              <w:fldChar w:fldCharType="separate"/>
-            </w:r>
-            <w:r>
-              <w:rPr>
-                <w:noProof/>
-                <w:webHidden/>
-              </w:rPr>
-              <w:t>3</w:t>
-            </w:r>
-            <w:r>
-              <w:rPr>
-                <w:noProof/>
                 <w:webHidden/>
               </w:rPr>
               <w:fldChar w:fldCharType="end"/>
@@ -1757,491 +1118,51 @@
               <w:kern w:val="2"/>
               <w:sz w:val="24"/>
               <w:szCs w:val="24"/>
-              <w:lang w:val="fi-FI" w:eastAsia="zh-CN"/>
+              <w:lang/>
               <w14:ligatures w14:val="standardContextual"/>
             </w:rPr>
           </w:pPr>
-          <w:hyperlink w:anchor="_Toc226987105" w:history="1">
+          <w:hyperlink w:anchor="_Toc244092271" w:history="1">
             <w:r>
               <w:rPr>
                 <w:rStyle w:val="Hyperlink"/>
               </w:rPr>
+              <w:t>References</w:t>
+            </w:r>
+            <w:r>
+              <w:rPr>
+                <w:webHidden/>
+              </w:rPr>
+              <w:tab/>
+            </w:r>
+            <w:r>
+              <w:rPr>
+                <w:webHidden/>
+              </w:rPr>
+              <w:fldChar w:fldCharType="begin"/>
+            </w:r>
+            <w:r>
+              <w:rPr>
+                <w:webHidden/>
+              </w:rPr>
+              <w:instrText xml:space="preserve"> PAGEREF _Toc244092271 \h </w:instrText>
+            </w:r>
+            <w:r>
+              <w:rPr>
+                <w:webHidden/>
+              </w:rPr>
+            </w:r>
+            <w:r>
+              <w:rPr>
+                <w:webHidden/>
+              </w:rPr>
+              <w:fldChar w:fldCharType="separate"/>
+            </w:r>
+            <w:r>
+              <w:rPr>
+                <w:webHidden/>
+              </w:rPr>
               <w:t>4</w:t>
-            </w:r>
-            <w:r>
-              <w:rPr>
-                <w:rFonts w:asciiTheme="minorHAnsi" w:eastAsiaTheme="minorEastAsia" w:hAnsiTheme="minorHAnsi" w:cstheme="minorBidi"/>
-                <w:kern w:val="2"/>
-                <w:sz w:val="24"/>
-                <w:szCs w:val="24"/>
-                <w:lang w:val="fi-FI" w:eastAsia="zh-CN"/>
-                <w14:ligatures w14:val="standardContextual"/>
-              </w:rPr>
-              <w:tab/>
-            </w:r>
-            <w:r>
-              <w:rPr>
-                <w:rStyle w:val="Hyperlink"/>
-              </w:rPr>
-              <w:t>Fourth subsection</w:t>
-            </w:r>
-            <w:r>
-              <w:rPr>
-                <w:webHidden/>
-              </w:rPr>
-              <w:tab/>
-            </w:r>
-            <w:r>
-              <w:rPr>
-                <w:webHidden/>
-              </w:rPr>
-              <w:fldChar w:fldCharType="begin"/>
-            </w:r>
-            <w:r>
-              <w:rPr>
-                <w:webHidden/>
-              </w:rPr>
-              <w:instrText xml:space="preserve"> PAGEREF _Toc226987105 \h </w:instrText>
-            </w:r>
-            <w:r>
-              <w:rPr>
-                <w:webHidden/>
-              </w:rPr>
-            </w:r>
-            <w:r>
-              <w:rPr>
-                <w:webHidden/>
-              </w:rPr>
-              <w:fldChar w:fldCharType="separate"/>
-            </w:r>
-            <w:r>
-              <w:rPr>
-                <w:webHidden/>
-              </w:rPr>
-              <w:t>4</w:t>
-            </w:r>
-            <w:r>
-              <w:rPr>
-                <w:webHidden/>
-              </w:rPr>
-              <w:fldChar w:fldCharType="end"/>
-            </w:r>
-          </w:hyperlink>
-        </w:p>
-        <w:p>
-          <w:pPr>
-            <w:pStyle w:val="TOC2"/>
-            <w:tabs>
-              <w:tab w:val="left" w:pos="960"/>
-              <w:tab w:val="right" w:leader="dot" w:pos="8777"/>
-            </w:tabs>
-            <w:rPr>
-              <w:rFonts w:asciiTheme="minorHAnsi" w:eastAsiaTheme="minorEastAsia" w:hAnsiTheme="minorHAnsi"/>
-              <w:noProof/>
-              <w:kern w:val="2"/>
-              <w:sz w:val="24"/>
-              <w:szCs w:val="24"/>
-              <w:lang w:val="fi-FI" w:eastAsia="zh-CN"/>
-              <w14:ligatures w14:val="standardContextual"/>
-            </w:rPr>
-          </w:pPr>
-          <w:hyperlink w:anchor="_Toc226987106" w:history="1">
-            <w:r>
-              <w:rPr>
-                <w:rStyle w:val="Hyperlink"/>
-                <w:noProof/>
-              </w:rPr>
-              <w:t>4.1</w:t>
-            </w:r>
-            <w:r>
-              <w:rPr>
-                <w:rFonts w:asciiTheme="minorHAnsi" w:eastAsiaTheme="minorEastAsia" w:hAnsiTheme="minorHAnsi"/>
-                <w:noProof/>
-                <w:kern w:val="2"/>
-                <w:sz w:val="24"/>
-                <w:szCs w:val="24"/>
-                <w:lang w:val="fi-FI" w:eastAsia="zh-CN"/>
-                <w14:ligatures w14:val="standardContextual"/>
-              </w:rPr>
-              <w:tab/>
-            </w:r>
-            <w:r>
-              <w:rPr>
-                <w:rStyle w:val="Hyperlink"/>
-                <w:noProof/>
-              </w:rPr>
-              <w:t>First subsection</w:t>
-            </w:r>
-            <w:r>
-              <w:rPr>
-                <w:noProof/>
-                <w:webHidden/>
-              </w:rPr>
-              <w:tab/>
-            </w:r>
-            <w:r>
-              <w:rPr>
-                <w:noProof/>
-                <w:webHidden/>
-              </w:rPr>
-              <w:fldChar w:fldCharType="begin"/>
-            </w:r>
-            <w:r>
-              <w:rPr>
-                <w:noProof/>
-                <w:webHidden/>
-              </w:rPr>
-              <w:instrText xml:space="preserve"> PAGEREF _Toc226987106 \h </w:instrText>
-            </w:r>
-            <w:r>
-              <w:rPr>
-                <w:noProof/>
-                <w:webHidden/>
-              </w:rPr>
-            </w:r>
-            <w:r>
-              <w:rPr>
-                <w:noProof/>
-                <w:webHidden/>
-              </w:rPr>
-              <w:fldChar w:fldCharType="separate"/>
-            </w:r>
-            <w:r>
-              <w:rPr>
-                <w:noProof/>
-                <w:webHidden/>
-              </w:rPr>
-              <w:t>4</w:t>
-            </w:r>
-            <w:r>
-              <w:rPr>
-                <w:noProof/>
-                <w:webHidden/>
-              </w:rPr>
-              <w:fldChar w:fldCharType="end"/>
-            </w:r>
-          </w:hyperlink>
-        </w:p>
-        <w:p>
-          <w:pPr>
-            <w:pStyle w:val="TOC2"/>
-            <w:tabs>
-              <w:tab w:val="left" w:pos="960"/>
-              <w:tab w:val="right" w:leader="dot" w:pos="8777"/>
-            </w:tabs>
-            <w:rPr>
-              <w:rFonts w:asciiTheme="minorHAnsi" w:eastAsiaTheme="minorEastAsia" w:hAnsiTheme="minorHAnsi"/>
-              <w:noProof/>
-              <w:kern w:val="2"/>
-              <w:sz w:val="24"/>
-              <w:szCs w:val="24"/>
-              <w:lang w:val="fi-FI" w:eastAsia="zh-CN"/>
-              <w14:ligatures w14:val="standardContextual"/>
-            </w:rPr>
-          </w:pPr>
-          <w:hyperlink w:anchor="_Toc226987107" w:history="1">
-            <w:r>
-              <w:rPr>
-                <w:rStyle w:val="Hyperlink"/>
-                <w:noProof/>
-              </w:rPr>
-              <w:t>4.2</w:t>
-            </w:r>
-            <w:r>
-              <w:rPr>
-                <w:rFonts w:asciiTheme="minorHAnsi" w:eastAsiaTheme="minorEastAsia" w:hAnsiTheme="minorHAnsi"/>
-                <w:noProof/>
-                <w:kern w:val="2"/>
-                <w:sz w:val="24"/>
-                <w:szCs w:val="24"/>
-                <w:lang w:val="fi-FI" w:eastAsia="zh-CN"/>
-                <w14:ligatures w14:val="standardContextual"/>
-              </w:rPr>
-              <w:tab/>
-            </w:r>
-            <w:r>
-              <w:rPr>
-                <w:rStyle w:val="Hyperlink"/>
-                <w:noProof/>
-              </w:rPr>
-              <w:t>Second subsection</w:t>
-            </w:r>
-            <w:r>
-              <w:rPr>
-                <w:noProof/>
-                <w:webHidden/>
-              </w:rPr>
-              <w:tab/>
-            </w:r>
-            <w:r>
-              <w:rPr>
-                <w:noProof/>
-                <w:webHidden/>
-              </w:rPr>
-              <w:fldChar w:fldCharType="begin"/>
-            </w:r>
-            <w:r>
-              <w:rPr>
-                <w:noProof/>
-                <w:webHidden/>
-              </w:rPr>
-              <w:instrText xml:space="preserve"> PAGEREF _Toc226987107 \h </w:instrText>
-            </w:r>
-            <w:r>
-              <w:rPr>
-                <w:noProof/>
-                <w:webHidden/>
-              </w:rPr>
-            </w:r>
-            <w:r>
-              <w:rPr>
-                <w:noProof/>
-                <w:webHidden/>
-              </w:rPr>
-              <w:fldChar w:fldCharType="separate"/>
-            </w:r>
-            <w:r>
-              <w:rPr>
-                <w:noProof/>
-                <w:webHidden/>
-              </w:rPr>
-              <w:t>4</w:t>
-            </w:r>
-            <w:r>
-              <w:rPr>
-                <w:noProof/>
-                <w:webHidden/>
-              </w:rPr>
-              <w:fldChar w:fldCharType="end"/>
-            </w:r>
-          </w:hyperlink>
-        </w:p>
-        <w:p>
-          <w:pPr>
-            <w:pStyle w:val="TOC2"/>
-            <w:tabs>
-              <w:tab w:val="left" w:pos="960"/>
-              <w:tab w:val="right" w:leader="dot" w:pos="8777"/>
-            </w:tabs>
-            <w:rPr>
-              <w:rFonts w:asciiTheme="minorHAnsi" w:eastAsiaTheme="minorEastAsia" w:hAnsiTheme="minorHAnsi"/>
-              <w:noProof/>
-              <w:kern w:val="2"/>
-              <w:sz w:val="24"/>
-              <w:szCs w:val="24"/>
-              <w:lang w:val="fi-FI" w:eastAsia="zh-CN"/>
-              <w14:ligatures w14:val="standardContextual"/>
-            </w:rPr>
-          </w:pPr>
-          <w:hyperlink w:anchor="_Toc226987108" w:history="1">
-            <w:r>
-              <w:rPr>
-                <w:rStyle w:val="Hyperlink"/>
-                <w:noProof/>
-              </w:rPr>
-              <w:t>4.3</w:t>
-            </w:r>
-            <w:r>
-              <w:rPr>
-                <w:rFonts w:asciiTheme="minorHAnsi" w:eastAsiaTheme="minorEastAsia" w:hAnsiTheme="minorHAnsi"/>
-                <w:noProof/>
-                <w:kern w:val="2"/>
-                <w:sz w:val="24"/>
-                <w:szCs w:val="24"/>
-                <w:lang w:val="fi-FI" w:eastAsia="zh-CN"/>
-                <w14:ligatures w14:val="standardContextual"/>
-              </w:rPr>
-              <w:tab/>
-            </w:r>
-            <w:r>
-              <w:rPr>
-                <w:rStyle w:val="Hyperlink"/>
-                <w:noProof/>
-              </w:rPr>
-              <w:t>Third subsection</w:t>
-            </w:r>
-            <w:r>
-              <w:rPr>
-                <w:noProof/>
-                <w:webHidden/>
-              </w:rPr>
-              <w:tab/>
-            </w:r>
-            <w:r>
-              <w:rPr>
-                <w:noProof/>
-                <w:webHidden/>
-              </w:rPr>
-              <w:fldChar w:fldCharType="begin"/>
-            </w:r>
-            <w:r>
-              <w:rPr>
-                <w:noProof/>
-                <w:webHidden/>
-              </w:rPr>
-              <w:instrText xml:space="preserve"> PAGEREF _Toc226987108 \h </w:instrText>
-            </w:r>
-            <w:r>
-              <w:rPr>
-                <w:noProof/>
-                <w:webHidden/>
-              </w:rPr>
-            </w:r>
-            <w:r>
-              <w:rPr>
-                <w:noProof/>
-                <w:webHidden/>
-              </w:rPr>
-              <w:fldChar w:fldCharType="separate"/>
-            </w:r>
-            <w:r>
-              <w:rPr>
-                <w:noProof/>
-                <w:webHidden/>
-              </w:rPr>
-              <w:t>4</w:t>
-            </w:r>
-            <w:r>
-              <w:rPr>
-                <w:noProof/>
-                <w:webHidden/>
-              </w:rPr>
-              <w:fldChar w:fldCharType="end"/>
-            </w:r>
-          </w:hyperlink>
-        </w:p>
-        <w:p>
-          <w:pPr>
-            <w:pStyle w:val="TOC1"/>
-            <w:rPr>
-              <w:rFonts w:asciiTheme="minorHAnsi" w:eastAsiaTheme="minorEastAsia" w:hAnsiTheme="minorHAnsi" w:cstheme="minorBidi"/>
-              <w:kern w:val="2"/>
-              <w:sz w:val="24"/>
-              <w:szCs w:val="24"/>
-              <w:lang w:val="fi-FI" w:eastAsia="zh-CN"/>
-              <w14:ligatures w14:val="standardContextual"/>
-            </w:rPr>
-          </w:pPr>
-          <w:hyperlink w:anchor="_Toc226987109" w:history="1">
-            <w:r>
-              <w:rPr>
-                <w:rStyle w:val="Hyperlink"/>
-              </w:rPr>
-              <w:t>5</w:t>
-            </w:r>
-            <w:r>
-              <w:rPr>
-                <w:rFonts w:asciiTheme="minorHAnsi" w:eastAsiaTheme="minorEastAsia" w:hAnsiTheme="minorHAnsi" w:cstheme="minorBidi"/>
-                <w:kern w:val="2"/>
-                <w:sz w:val="24"/>
-                <w:szCs w:val="24"/>
-                <w:lang w:val="fi-FI" w:eastAsia="zh-CN"/>
-                <w14:ligatures w14:val="standardContextual"/>
-              </w:rPr>
-              <w:tab/>
-            </w:r>
-            <w:r>
-              <w:rPr>
-                <w:rStyle w:val="Hyperlink"/>
-              </w:rPr>
-              <w:t>Summary and discussion</w:t>
-            </w:r>
-            <w:r>
-              <w:rPr>
-                <w:webHidden/>
-              </w:rPr>
-              <w:tab/>
-            </w:r>
-            <w:r>
-              <w:rPr>
-                <w:webHidden/>
-              </w:rPr>
-              <w:fldChar w:fldCharType="begin"/>
-            </w:r>
-            <w:r>
-              <w:rPr>
-                <w:webHidden/>
-              </w:rPr>
-              <w:instrText xml:space="preserve"> PAGEREF _Toc226987109 \h </w:instrText>
-            </w:r>
-            <w:r>
-              <w:rPr>
-                <w:webHidden/>
-              </w:rPr>
-            </w:r>
-            <w:r>
-              <w:rPr>
-                <w:webHidden/>
-              </w:rPr>
-              <w:fldChar w:fldCharType="separate"/>
-            </w:r>
-            <w:r>
-              <w:rPr>
-                <w:webHidden/>
-              </w:rPr>
-              <w:t>5</w:t>
-            </w:r>
-            <w:r>
-              <w:rPr>
-                <w:webHidden/>
-              </w:rPr>
-              <w:fldChar w:fldCharType="end"/>
-            </w:r>
-          </w:hyperlink>
-        </w:p>
-        <w:p>
-          <w:pPr>
-            <w:pStyle w:val="TOC1"/>
-            <w:rPr>
-              <w:rFonts w:asciiTheme="minorHAnsi" w:eastAsiaTheme="minorEastAsia" w:hAnsiTheme="minorHAnsi" w:cstheme="minorBidi"/>
-              <w:kern w:val="2"/>
-              <w:sz w:val="24"/>
-              <w:szCs w:val="24"/>
-              <w:lang w:val="fi-FI" w:eastAsia="zh-CN"/>
-              <w14:ligatures w14:val="standardContextual"/>
-            </w:rPr>
-          </w:pPr>
-          <w:hyperlink w:anchor="_Toc226987110" w:history="1">
-            <w:r>
-              <w:rPr>
-                <w:rStyle w:val="Hyperlink"/>
-              </w:rPr>
-              <w:t>References</w:t>
-            </w:r>
-            <w:r>
-              <w:rPr>
-                <w:webHidden/>
-              </w:rPr>
-              <w:tab/>
-            </w:r>
-            <w:r>
-              <w:rPr>
-                <w:webHidden/>
-              </w:rPr>
-              <w:fldChar w:fldCharType="begin"/>
-            </w:r>
-            <w:r>
-              <w:rPr>
-                <w:webHidden/>
-              </w:rPr>
-              <w:instrText xml:space="preserve"> PAGEREF _Toc226987110 \h </w:instrText>
-            </w:r>
-            <w:r>
-              <w:rPr>
-                <w:webHidden/>
-              </w:rPr>
-            </w:r>
-            <w:r>
-              <w:rPr>
-                <w:webHidden/>
-              </w:rPr>
-              <w:fldChar w:fldCharType="separate"/>
-            </w:r>
-            <w:r>
-              <w:rPr>
-                <w:webHidden/>
-              </w:rPr>
-              <w:t>6</w:t>
             </w:r>
             <w:r>
               <w:rPr>
@@ -2270,22 +1191,6 @@
     <w:p>
       <w:pPr>
         <w:pStyle w:val="LABnormal"/>
-      </w:pPr>
-      <w:r>
-        <w:t>Appendix 1. Appendix title</w:t>
-      </w:r>
-    </w:p>
-    <w:p>
-      <w:pPr>
-        <w:pStyle w:val="LABnormal"/>
-      </w:pPr>
-      <w:r>
-        <w:t xml:space="preserve">Appendix 2. Appendix title </w:t>
-      </w:r>
-    </w:p>
-    <w:p>
-      <w:pPr>
-        <w:pStyle w:val="LABnormal"/>
         <w:rPr>
           <w:b/>
           <w:bCs/>
@@ -2316,306 +1221,15 @@
       <w:pPr>
         <w:pStyle w:val="LABHeading1"/>
       </w:pPr>
-      <w:bookmarkStart w:id="0" w:name="_Toc226987096"/>
-      <w:bookmarkStart w:id="1" w:name="_Hlk36035422"/>
+      <w:bookmarkStart w:id="0" w:name="_Hlk36035422"/>
+      <w:bookmarkStart w:id="1" w:name="_Toc244092268"/>
       <w:r>
         <w:lastRenderedPageBreak/>
-        <w:t>Introduction</w:t>
-      </w:r>
-      <w:bookmarkEnd w:id="0"/>
-    </w:p>
-    <w:p>
-      <w:pPr>
-        <w:pStyle w:val="LABnormal"/>
-      </w:pPr>
-      <w:r>
-        <w:t xml:space="preserve">Read the thesis </w:t>
-      </w:r>
-      <w:r>
-        <w:t>guidelines</w:t>
-      </w:r>
-      <w:r>
-        <w:t xml:space="preserve"> used at LAB University of Applied Sciences</w:t>
-      </w:r>
-      <w:r>
-        <w:t xml:space="preserve">. Regarding writing the thesis report, </w:t>
-      </w:r>
-      <w:r>
-        <w:t xml:space="preserve">read </w:t>
-      </w:r>
-      <w:r>
-        <w:t>especially</w:t>
-      </w:r>
-      <w:r>
-        <w:t xml:space="preserve"> </w:t>
-      </w:r>
-      <w:r>
-        <w:t>C</w:t>
-      </w:r>
-      <w:r>
-        <w:t>hapter 6</w:t>
-      </w:r>
-      <w:r>
-        <w:t>,</w:t>
-      </w:r>
-      <w:r>
-        <w:t xml:space="preserve"> </w:t>
-      </w:r>
-      <w:r>
-        <w:t>R</w:t>
-      </w:r>
-      <w:r>
-        <w:t>esearch-based text, visual representations, structure, and layout,</w:t>
-      </w:r>
-      <w:r>
-        <w:t xml:space="preserve"> and</w:t>
-      </w:r>
-      <w:r>
-        <w:t xml:space="preserve"> </w:t>
-      </w:r>
-      <w:r>
-        <w:t>C</w:t>
-      </w:r>
-      <w:r>
-        <w:t>hapter 7</w:t>
-      </w:r>
-      <w:r>
-        <w:t>,</w:t>
-      </w:r>
-      <w:r>
-        <w:t xml:space="preserve"> Information</w:t>
-      </w:r>
-      <w:r>
-        <w:t xml:space="preserve"> collection and referencing mechanics</w:t>
-      </w:r>
-      <w:r>
-        <w:t xml:space="preserve">. Follow the </w:t>
-      </w:r>
-      <w:r>
-        <w:t>guidelines</w:t>
-      </w:r>
-      <w:r>
-        <w:t xml:space="preserve"> carefully.</w:t>
-      </w:r>
-    </w:p>
-    <w:p>
-      <w:pPr>
-        <w:pStyle w:val="LABnormal"/>
-      </w:pPr>
-      <w:r>
-        <w:t>This is the template used for writing thesis reports at LAB</w:t>
-      </w:r>
-      <w:r>
-        <w:t xml:space="preserve">.  </w:t>
-      </w:r>
-      <w:r>
-        <w:t xml:space="preserve">Even before you start </w:t>
-      </w:r>
-      <w:r>
-        <w:t>the writing process</w:t>
-      </w:r>
-      <w:r>
-        <w:t xml:space="preserve">, it is </w:t>
-      </w:r>
-      <w:r>
-        <w:t>advisable</w:t>
-      </w:r>
-      <w:r>
-        <w:t xml:space="preserve"> to ensure that you have sufficient</w:t>
-      </w:r>
-      <w:r>
-        <w:t xml:space="preserve"> basic skills in editing long documents with a word </w:t>
-      </w:r>
-      <w:r>
-        <w:t>processor</w:t>
-      </w:r>
-      <w:r>
-        <w:t>. These skills include</w:t>
-      </w:r>
-      <w:r>
-        <w:t xml:space="preserve"> </w:t>
-      </w:r>
-      <w:r>
-        <w:t>the use of the Style</w:t>
-      </w:r>
-      <w:r>
-        <w:t>s</w:t>
-      </w:r>
-      <w:r>
-        <w:t xml:space="preserve"> tool and an understanding of document sections</w:t>
-      </w:r>
-      <w:r>
-        <w:t>.</w:t>
-      </w:r>
-      <w:r>
-        <w:t xml:space="preserve"> </w:t>
-      </w:r>
-      <w:r>
-        <w:t>To understand</w:t>
-      </w:r>
-      <w:r>
-        <w:t xml:space="preserve"> how to use this thesis template, you need to have internalised the following basics regarding MS Word:</w:t>
-      </w:r>
-    </w:p>
-    <w:bookmarkEnd w:id="1"/>
-    <w:p>
-      <w:pPr>
-        <w:pStyle w:val="LABbulletlist"/>
-        <w:numPr>
-          <w:ilvl w:val="0"/>
-          <w:numId w:val="13"/>
-        </w:numPr>
-      </w:pPr>
-      <w:r>
-        <w:t>No text is positioned</w:t>
-      </w:r>
-      <w:r>
-        <w:t>,</w:t>
-      </w:r>
-      <w:r>
-        <w:t xml:space="preserve"> nor any layout done</w:t>
-      </w:r>
-      <w:r>
-        <w:t>,</w:t>
-      </w:r>
-      <w:r>
-        <w:t xml:space="preserve"> </w:t>
-      </w:r>
-      <w:r>
-        <w:t>by adding</w:t>
-      </w:r>
-      <w:r>
-        <w:t xml:space="preserve"> multiple consecutive spaces or line or paragraph breaks. If you need to press Enter or </w:t>
-      </w:r>
-      <w:r>
-        <w:t>S</w:t>
-      </w:r>
-      <w:r>
-        <w:t xml:space="preserve">pace bar more than once in succession, you are probably doing something wrong. When </w:t>
-      </w:r>
-      <w:r>
-        <w:t>starting</w:t>
-      </w:r>
-      <w:r>
-        <w:t xml:space="preserve"> a new paragraph, press Enter once at the end of the line, and the space between the paragraphs is </w:t>
-      </w:r>
-      <w:r>
-        <w:t>added using</w:t>
-      </w:r>
-      <w:r>
-        <w:t xml:space="preserve"> styles.</w:t>
-      </w:r>
-    </w:p>
-    <w:p>
-      <w:pPr>
-        <w:pStyle w:val="LABbulletlist"/>
-        <w:numPr>
-          <w:ilvl w:val="0"/>
-          <w:numId w:val="13"/>
-        </w:numPr>
-      </w:pPr>
-      <w:r>
-        <w:t xml:space="preserve">It </w:t>
-      </w:r>
-      <w:r>
-        <w:t xml:space="preserve">is </w:t>
-      </w:r>
-      <w:r>
-        <w:t>not advisable</w:t>
-      </w:r>
-      <w:r>
-        <w:t xml:space="preserve"> to produce any num</w:t>
-      </w:r>
-      <w:r>
-        <w:t>eric details (i.e.,</w:t>
-      </w:r>
-      <w:r>
-        <w:t xml:space="preserve"> </w:t>
-      </w:r>
-      <w:r>
-        <w:t>paragraph numbers, page number</w:t>
-      </w:r>
-      <w:r>
-        <w:t>s</w:t>
-      </w:r>
-      <w:r>
-        <w:t>,</w:t>
-      </w:r>
-      <w:r>
-        <w:t xml:space="preserve"> or</w:t>
-      </w:r>
-      <w:r>
-        <w:t xml:space="preserve"> numbering of </w:t>
-      </w:r>
-      <w:r>
-        <w:t>images</w:t>
-      </w:r>
-      <w:r>
-        <w:t>/tables/</w:t>
-      </w:r>
-      <w:r>
-        <w:t>figures</w:t>
-      </w:r>
-      <w:r>
-        <w:t>/appendices</w:t>
-      </w:r>
-      <w:r>
-        <w:t xml:space="preserve">) </w:t>
-      </w:r>
-      <w:r>
-        <w:t>by manually entering the numbers. For all of these, Word provides powerful automated tools that keep numbering organised, even if you edit, add</w:t>
-      </w:r>
-      <w:r>
-        <w:t>,</w:t>
-      </w:r>
-      <w:r>
-        <w:t xml:space="preserve"> or delete data.</w:t>
-      </w:r>
-    </w:p>
-    <w:p>
-      <w:pPr>
-        <w:pStyle w:val="LABbulletlist"/>
-        <w:numPr>
-          <w:ilvl w:val="0"/>
-          <w:numId w:val="0"/>
-        </w:numPr>
-        <w:ind w:left="720"/>
-      </w:pPr>
-    </w:p>
-    <w:p>
-      <w:pPr>
-        <w:pStyle w:val="LABbulletlist"/>
-        <w:numPr>
-          <w:ilvl w:val="0"/>
-          <w:numId w:val="0"/>
-        </w:numPr>
-      </w:pPr>
-      <w:r>
-        <w:t>Never add hyphens to words at the end of a line by manually typing them. In the thesis template, Word’s automatic hyphenation is enabled. If you need to add hyphens yourself, you can use the optional hyphen tool in Word.</w:t>
-      </w:r>
-    </w:p>
-    <w:p>
-      <w:pPr>
-        <w:pStyle w:val="LABnon-numberedsubtitlebolded"/>
-        <w:rPr>
-          <w:lang w:val="en-US"/>
-        </w:rPr>
-      </w:pPr>
-    </w:p>
-    <w:p>
-      <w:pPr>
-        <w:pStyle w:val="LABnon-numberedsubtitlebolded"/>
-        <w:rPr>
-          <w:lang w:val="en-US"/>
-        </w:rPr>
-      </w:pPr>
-      <w:r>
-        <w:rPr>
-          <w:lang w:val="en-US"/>
-        </w:rPr>
-        <w:t>The styles you need for writing your thesis</w:t>
-      </w:r>
-    </w:p>
+        <w:t>Tests used</w:t>
+      </w:r>
+      <w:bookmarkEnd w:id="1"/>
+    </w:p>
+    <w:bookmarkEnd w:id="0"/>
     <w:p>
       <w:pPr>
         <w:pStyle w:val="LABnormal"/>
@@ -2627,19 +1241,43 @@
         <w:rPr>
           <w:lang w:val="en-US"/>
         </w:rPr>
-        <w:t>Styles appear at the top of the document (in the Word toolbar) under "Styles"</w:t>
+        <w:t xml:space="preserve">The testing methods I used were the same as the previous </w:t>
       </w:r>
       <w:r>
         <w:rPr>
           <w:lang w:val="en-US"/>
         </w:rPr>
-        <w:t xml:space="preserve">: </w:t>
+        <w:t>task;</w:t>
       </w:r>
       <w:r>
         <w:rPr>
           <w:lang w:val="en-US"/>
         </w:rPr>
-        <w:tab/>
+        <w:t xml:space="preserve"> I also did some general input testing manually to make sure that the input validation was working. In </w:t>
+      </w:r>
+      <w:r>
+        <w:rPr>
+          <w:lang w:val="en-US"/>
+        </w:rPr>
+        <w:t>general,</w:t>
+      </w:r>
+      <w:r>
+        <w:rPr>
+          <w:lang w:val="en-US"/>
+        </w:rPr>
+        <w:t xml:space="preserve"> what I tested for was: did the page load, did the buttons work, was there any overflow and how it handled resizing the window. I chose to redo the automated tests from the last task as there were </w:t>
+      </w:r>
+      <w:r>
+        <w:rPr>
+          <w:lang w:val="en-US"/>
+        </w:rPr>
+        <w:t xml:space="preserve">a couple of tests in it that were good for testing my web app. I did input validation </w:t>
+      </w:r>
+      <w:r>
+        <w:rPr>
+          <w:lang w:val="en-US"/>
+        </w:rPr>
+        <w:t xml:space="preserve">manually because making an automated one is not needed for an application of this simplicity. </w:t>
       </w:r>
     </w:p>
     <w:p>
@@ -2653,13 +1291,101 @@
         <w:rPr>
           <w:lang w:val="en-US"/>
         </w:rPr>
-        <w:t xml:space="preserve">LAB abstract text, </w:t>
+        <w:t xml:space="preserve"> </w:t>
       </w:r>
       <w:r>
         <w:rPr>
+          <w:noProof/>
           <w:lang w:val="en-US"/>
         </w:rPr>
-        <w:t>when filling out the abstract</w:t>
+        <w:drawing>
+          <wp:inline distT="0" distB="0" distL="0" distR="0" wp14:anchorId="54FD934C" wp14:editId="6CB0F036">
+            <wp:extent cx="2608529" cy="2827020"/>
+            <wp:effectExtent l="0" t="0" r="1905" b="0"/>
+            <wp:docPr id="12040882" name="Picture 1"/>
+            <wp:cNvGraphicFramePr>
+              <a:graphicFrameLocks xmlns:a="http://schemas.openxmlformats.org/drawingml/2006/main" noChangeAspect="1"/>
+            </wp:cNvGraphicFramePr>
+            <a:graphic xmlns:a="http://schemas.openxmlformats.org/drawingml/2006/main">
+              <a:graphicData uri="http://schemas.openxmlformats.org/drawingml/2006/picture">
+                <pic:pic xmlns:pic="http://schemas.openxmlformats.org/drawingml/2006/picture">
+                  <pic:nvPicPr>
+                    <pic:cNvPr id="12040882" name="Picture 12040882"/>
+                    <pic:cNvPicPr/>
+                  </pic:nvPicPr>
+                  <pic:blipFill>
+                    <a:blip r:embed="rId13">
+                      <a:extLst>
+                        <a:ext uri="{28A0092B-C50C-407E-A947-70E740481C1C}">
+                          <a14:useLocalDpi xmlns:a14="http://schemas.microsoft.com/office/drawing/2010/main" val="0"/>
+                        </a:ext>
+                      </a:extLst>
+                    </a:blip>
+                    <a:stretch>
+                      <a:fillRect/>
+                    </a:stretch>
+                  </pic:blipFill>
+                  <pic:spPr>
+                    <a:xfrm>
+                      <a:off x="0" y="0"/>
+                      <a:ext cx="2614714" cy="2833723"/>
+                    </a:xfrm>
+                    <a:prstGeom prst="rect">
+                      <a:avLst/>
+                    </a:prstGeom>
+                  </pic:spPr>
+                </pic:pic>
+              </a:graphicData>
+            </a:graphic>
+          </wp:inline>
+        </w:drawing>
+      </w:r>
+      <w:r>
+        <w:rPr>
+          <w:noProof/>
+          <w:lang w:val="en-US"/>
+        </w:rPr>
+        <w:drawing>
+          <wp:inline distT="0" distB="0" distL="0" distR="0" wp14:anchorId="181DE9B0" wp14:editId="5AFC41D3">
+            <wp:extent cx="2179320" cy="2810770"/>
+            <wp:effectExtent l="0" t="0" r="0" b="8890"/>
+            <wp:docPr id="513991486" name="Picture 3"/>
+            <wp:cNvGraphicFramePr>
+              <a:graphicFrameLocks xmlns:a="http://schemas.openxmlformats.org/drawingml/2006/main" noChangeAspect="1"/>
+            </wp:cNvGraphicFramePr>
+            <a:graphic xmlns:a="http://schemas.openxmlformats.org/drawingml/2006/main">
+              <a:graphicData uri="http://schemas.openxmlformats.org/drawingml/2006/picture">
+                <pic:pic xmlns:pic="http://schemas.openxmlformats.org/drawingml/2006/picture">
+                  <pic:nvPicPr>
+                    <pic:cNvPr id="513991486" name="Picture 513991486"/>
+                    <pic:cNvPicPr/>
+                  </pic:nvPicPr>
+                  <pic:blipFill>
+                    <a:blip r:embed="rId14" cstate="print">
+                      <a:extLst>
+                        <a:ext uri="{28A0092B-C50C-407E-A947-70E740481C1C}">
+                          <a14:useLocalDpi xmlns:a14="http://schemas.microsoft.com/office/drawing/2010/main" val="0"/>
+                        </a:ext>
+                      </a:extLst>
+                    </a:blip>
+                    <a:stretch>
+                      <a:fillRect/>
+                    </a:stretch>
+                  </pic:blipFill>
+                  <pic:spPr>
+                    <a:xfrm>
+                      <a:off x="0" y="0"/>
+                      <a:ext cx="2182502" cy="2814873"/>
+                    </a:xfrm>
+                    <a:prstGeom prst="rect">
+                      <a:avLst/>
+                    </a:prstGeom>
+                  </pic:spPr>
+                </pic:pic>
+              </a:graphicData>
+            </a:graphic>
+          </wp:inline>
+        </w:drawing>
       </w:r>
     </w:p>
     <w:p>
@@ -2669,30 +1395,6 @@
           <w:lang w:val="en-US"/>
         </w:rPr>
       </w:pPr>
-      <w:r>
-        <w:rPr>
-          <w:lang w:val="en-US"/>
-        </w:rPr>
-        <w:t xml:space="preserve">LAB Non-numbered heading, </w:t>
-      </w:r>
-      <w:r>
-        <w:rPr>
-          <w:lang w:val="en-US"/>
-        </w:rPr>
-        <w:t xml:space="preserve">when adding a non-numbered </w:t>
-      </w:r>
-      <w:r>
-        <w:rPr>
-          <w:lang w:val="en-US"/>
-        </w:rPr>
-        <w:t xml:space="preserve">main </w:t>
-      </w:r>
-      <w:r>
-        <w:rPr>
-          <w:lang w:val="en-US"/>
-        </w:rPr>
-        <w:t>heading, such as Concepts</w:t>
-      </w:r>
     </w:p>
     <w:p>
       <w:pPr>
@@ -2703,902 +1405,135 @@
       </w:pPr>
       <w:r>
         <w:rPr>
+          <w:noProof/>
           <w:lang w:val="en-US"/>
         </w:rPr>
-        <w:t xml:space="preserve">LAB Heading 1, </w:t>
-      </w:r>
-      <w:r>
-        <w:rPr>
-          <w:lang w:val="en-US"/>
-        </w:rPr>
-        <w:t xml:space="preserve">when adding </w:t>
-      </w:r>
-      <w:r>
-        <w:rPr>
-          <w:lang w:val="en-US"/>
-        </w:rPr>
-        <w:t xml:space="preserve">a </w:t>
-      </w:r>
-      <w:r>
-        <w:rPr>
-          <w:lang w:val="en-US"/>
-        </w:rPr>
-        <w:t>main section</w:t>
-      </w:r>
-      <w:r>
-        <w:rPr>
-          <w:lang w:val="en-US"/>
-        </w:rPr>
-        <w:t xml:space="preserve"> heading</w:t>
-      </w:r>
-      <w:r>
-        <w:rPr>
-          <w:lang w:val="en-US"/>
-        </w:rPr>
-        <w:t xml:space="preserve"> (</w:t>
-      </w:r>
-      <w:r>
-        <w:rPr>
-          <w:lang w:val="en-US"/>
-        </w:rPr>
-        <w:t>one digit before the heading, e.g., 1</w:t>
-      </w:r>
-      <w:r>
-        <w:rPr>
-          <w:lang w:val="en-US"/>
-        </w:rPr>
-        <w:t>)</w:t>
-      </w:r>
+        <w:drawing>
+          <wp:inline distT="0" distB="0" distL="0" distR="0" wp14:anchorId="1C0C06BB" wp14:editId="65BAC79D">
+            <wp:extent cx="5239481" cy="1600423"/>
+            <wp:effectExtent l="0" t="0" r="0" b="0"/>
+            <wp:docPr id="296399201" name="Picture 4"/>
+            <wp:cNvGraphicFramePr>
+              <a:graphicFrameLocks xmlns:a="http://schemas.openxmlformats.org/drawingml/2006/main" noChangeAspect="1"/>
+            </wp:cNvGraphicFramePr>
+            <a:graphic xmlns:a="http://schemas.openxmlformats.org/drawingml/2006/main">
+              <a:graphicData uri="http://schemas.openxmlformats.org/drawingml/2006/picture">
+                <pic:pic xmlns:pic="http://schemas.openxmlformats.org/drawingml/2006/picture">
+                  <pic:nvPicPr>
+                    <pic:cNvPr id="296399201" name="Picture 296399201"/>
+                    <pic:cNvPicPr/>
+                  </pic:nvPicPr>
+                  <pic:blipFill>
+                    <a:blip r:embed="rId15">
+                      <a:extLst>
+                        <a:ext uri="{28A0092B-C50C-407E-A947-70E740481C1C}">
+                          <a14:useLocalDpi xmlns:a14="http://schemas.microsoft.com/office/drawing/2010/main" val="0"/>
+                        </a:ext>
+                      </a:extLst>
+                    </a:blip>
+                    <a:stretch>
+                      <a:fillRect/>
+                    </a:stretch>
+                  </pic:blipFill>
+                  <pic:spPr>
+                    <a:xfrm>
+                      <a:off x="0" y="0"/>
+                      <a:ext cx="5239481" cy="1600423"/>
+                    </a:xfrm>
+                    <a:prstGeom prst="rect">
+                      <a:avLst/>
+                    </a:prstGeom>
+                  </pic:spPr>
+                </pic:pic>
+              </a:graphicData>
+            </a:graphic>
+          </wp:inline>
+        </w:drawing>
+      </w:r>
+    </w:p>
+    <w:p>
+      <w:pPr>
+        <w:pStyle w:val="LABHeading1"/>
+      </w:pPr>
+      <w:bookmarkStart w:id="2" w:name="_Toc244092269"/>
+      <w:r>
+        <w:lastRenderedPageBreak/>
+        <w:t>Advantages and disadvantages</w:t>
+      </w:r>
+      <w:bookmarkEnd w:id="2"/>
     </w:p>
     <w:p>
       <w:pPr>
         <w:pStyle w:val="LABnormal"/>
-        <w:rPr>
-          <w:lang w:val="en-US"/>
-        </w:rPr>
-      </w:pPr>
-      <w:r>
-        <w:rPr>
-          <w:lang w:val="en-US"/>
-        </w:rPr>
-        <w:t xml:space="preserve">LAB Heading 2, </w:t>
-      </w:r>
-      <w:r>
-        <w:rPr>
-          <w:lang w:val="en-US"/>
-        </w:rPr>
-        <w:t>when adding a subsection</w:t>
-      </w:r>
-      <w:r>
-        <w:rPr>
-          <w:lang w:val="en-US"/>
-        </w:rPr>
+      </w:pPr>
+      <w:r>
+        <w:t>Using an old automated test would mean that the some of them would not be tailored for this webpage and that means there could be holes in the tests. While using an old, generalized test means that you could check for the most common issues relating to webpage design. Manual testing has limits and most of those limits are because manual testing can’t huge batches of test points.  The benefits of manual input testing are that you can just go through a list of the most common inputs that produce errors to see if your system works.</w:t>
+      </w:r>
+    </w:p>
+    <w:p>
+      <w:pPr>
+        <w:pStyle w:val="LABHeading1"/>
+      </w:pPr>
+      <w:bookmarkStart w:id="3" w:name="_Toc244092270"/>
+      <w:r>
+        <w:lastRenderedPageBreak/>
+        <w:t>Unimplemented alternatives</w:t>
+      </w:r>
+      <w:bookmarkEnd w:id="3"/>
+    </w:p>
+    <w:p>
+      <w:pPr>
+        <w:pStyle w:val="LABnormal"/>
+      </w:pPr>
+      <w:r>
+        <w:t>I could have implemented a rate test by constantly editing the hex code to see if the server and browser could handle the constant input changes.</w:t>
+      </w:r>
+      <w:r>
         <w:t xml:space="preserve"> </w:t>
       </w:r>
       <w:r>
-        <w:rPr>
-          <w:lang w:val="en-US"/>
-        </w:rPr>
-        <w:t xml:space="preserve">heading </w:t>
-      </w:r>
-      <w:r>
-        <w:rPr>
-          <w:lang w:val="en-US"/>
-        </w:rPr>
-        <w:t xml:space="preserve">(2 </w:t>
-      </w:r>
-      <w:r>
-        <w:rPr>
-          <w:lang w:val="en-US"/>
-        </w:rPr>
-        <w:t>digits before the heading, e.g., 1.1</w:t>
-      </w:r>
-      <w:r>
-        <w:rPr>
-          <w:lang w:val="en-US"/>
-        </w:rPr>
-        <w:t>)</w:t>
-      </w:r>
-    </w:p>
-    <w:p>
-      <w:pPr>
-        <w:pStyle w:val="LABnormal"/>
-        <w:rPr>
-          <w:lang w:val="en-US"/>
-        </w:rPr>
-      </w:pPr>
-      <w:r>
-        <w:rPr>
-          <w:lang w:val="en-US"/>
-        </w:rPr>
-        <w:lastRenderedPageBreak/>
-        <w:t xml:space="preserve">LAB Heading 3, </w:t>
-      </w:r>
-      <w:r>
-        <w:rPr>
-          <w:lang w:val="en-US"/>
-        </w:rPr>
-        <w:t xml:space="preserve">when adding </w:t>
-      </w:r>
-      <w:r>
-        <w:rPr>
-          <w:lang w:val="en-US"/>
-        </w:rPr>
-        <w:t xml:space="preserve">the heading for </w:t>
-      </w:r>
-      <w:r>
-        <w:rPr>
-          <w:lang w:val="en-US"/>
-        </w:rPr>
-        <w:t xml:space="preserve">a subsection of a subsection </w:t>
-      </w:r>
-      <w:r>
-        <w:rPr>
-          <w:lang w:val="en-US"/>
-        </w:rPr>
-        <w:t>(</w:t>
-      </w:r>
-      <w:r>
-        <w:rPr>
-          <w:lang w:val="en-US"/>
-        </w:rPr>
-        <w:t>three digits before the heading, e.g., 1.1.1</w:t>
-      </w:r>
-      <w:r>
-        <w:rPr>
-          <w:lang w:val="en-US"/>
-        </w:rPr>
-        <w:t>)</w:t>
-      </w:r>
-    </w:p>
-    <w:p>
-      <w:pPr>
-        <w:pStyle w:val="LABnormal"/>
-        <w:rPr>
-          <w:lang w:val="en-US"/>
-        </w:rPr>
-      </w:pPr>
-      <w:r>
-        <w:rPr>
-          <w:lang w:val="en-US"/>
-        </w:rPr>
-        <w:t xml:space="preserve">LAB non-numbered subtitle (bolded), </w:t>
-      </w:r>
-      <w:r>
-        <w:rPr>
-          <w:lang w:val="en-US"/>
-        </w:rPr>
-        <w:t xml:space="preserve">when adding a bolded, non-numbered </w:t>
-      </w:r>
-      <w:r>
-        <w:rPr>
-          <w:lang w:val="en-US"/>
-        </w:rPr>
-        <w:t>subheading</w:t>
-      </w:r>
-    </w:p>
-    <w:p>
-      <w:pPr>
-        <w:pStyle w:val="LABnormal"/>
-        <w:rPr>
-          <w:lang w:val="en-US"/>
-        </w:rPr>
-      </w:pPr>
-      <w:r>
-        <w:rPr>
-          <w:lang w:val="en-US"/>
-        </w:rPr>
-        <w:t xml:space="preserve">LAB normal, </w:t>
-      </w:r>
-      <w:r>
-        <w:rPr>
-          <w:lang w:val="en-US"/>
-        </w:rPr>
-        <w:t>when writing body text</w:t>
-      </w:r>
-    </w:p>
-    <w:p>
-      <w:pPr>
-        <w:pStyle w:val="LABnormal"/>
-        <w:rPr>
-          <w:lang w:val="en-US"/>
-        </w:rPr>
-      </w:pPr>
-      <w:r>
-        <w:rPr>
-          <w:lang w:val="en-US"/>
-        </w:rPr>
-        <w:t>LAB Figure</w:t>
-      </w:r>
-      <w:r>
-        <w:rPr>
-          <w:lang w:val="en-US"/>
-        </w:rPr>
-        <w:t xml:space="preserve">, </w:t>
-      </w:r>
-      <w:r>
-        <w:rPr>
-          <w:lang w:val="en-US"/>
-        </w:rPr>
-        <w:t>when adding a figure</w:t>
-      </w:r>
-    </w:p>
-    <w:p>
-      <w:pPr>
-        <w:pStyle w:val="LABnormal"/>
-        <w:rPr>
-          <w:lang w:val="en-US"/>
-        </w:rPr>
-      </w:pPr>
-      <w:r>
-        <w:rPr>
-          <w:lang w:val="en-US"/>
-        </w:rPr>
-        <w:t xml:space="preserve">LAB Figure Title, </w:t>
-      </w:r>
-      <w:r>
-        <w:rPr>
-          <w:lang w:val="en-US"/>
-        </w:rPr>
-        <w:t>when adding the caption (label) for a figure</w:t>
-      </w:r>
-    </w:p>
-    <w:p>
-      <w:pPr>
-        <w:pStyle w:val="LABnormal"/>
-        <w:rPr>
-          <w:lang w:val="en-US"/>
-        </w:rPr>
-      </w:pPr>
-      <w:r>
-        <w:rPr>
-          <w:lang w:val="en-US"/>
-        </w:rPr>
-        <w:t xml:space="preserve">LAB Table Title, </w:t>
-      </w:r>
-      <w:r>
-        <w:rPr>
-          <w:lang w:val="en-US"/>
-        </w:rPr>
-        <w:t>when adding the caption for a table</w:t>
-      </w:r>
-    </w:p>
-    <w:p>
-      <w:pPr>
-        <w:pStyle w:val="LABnormal"/>
-        <w:rPr>
-          <w:lang w:val="en-US"/>
-        </w:rPr>
-      </w:pPr>
-      <w:r>
-        <w:rPr>
-          <w:lang w:val="en-US"/>
-        </w:rPr>
-        <w:t xml:space="preserve">LAB bullet list, </w:t>
-      </w:r>
-      <w:r>
-        <w:rPr>
-          <w:lang w:val="en-US"/>
-        </w:rPr>
-        <w:t>when creating a bullet list</w:t>
-      </w:r>
-    </w:p>
-    <w:p>
-      <w:pPr>
-        <w:pStyle w:val="LABnormal"/>
-        <w:rPr>
-          <w:lang w:val="en-US"/>
-        </w:rPr>
-      </w:pPr>
-      <w:r>
-        <w:rPr>
-          <w:lang w:val="en-US"/>
-        </w:rPr>
-        <w:t xml:space="preserve">LAB </w:t>
-      </w:r>
-      <w:r>
-        <w:rPr>
-          <w:i/>
-          <w:iCs/>
-          <w:lang w:val="en-US"/>
-        </w:rPr>
-        <w:t>citation</w:t>
-      </w:r>
-      <w:r>
-        <w:rPr>
-          <w:lang w:val="en-US"/>
-        </w:rPr>
-        <w:t xml:space="preserve">, </w:t>
-      </w:r>
-      <w:r>
-        <w:rPr>
-          <w:lang w:val="en-US"/>
-        </w:rPr>
-        <w:t>when adding a direct quotation (i.e., repeating the same words someone else had written or said)</w:t>
-      </w:r>
-      <w:r>
-        <w:rPr>
-          <w:lang w:val="en-US"/>
-        </w:rPr>
-        <w:t xml:space="preserve"> </w:t>
-      </w:r>
-    </w:p>
-    <w:p>
-      <w:pPr>
-        <w:pStyle w:val="LABHeading1"/>
-      </w:pPr>
-      <w:bookmarkStart w:id="2" w:name="_Toc226987097"/>
-      <w:r>
-        <w:lastRenderedPageBreak/>
-        <w:t>Second main section</w:t>
-      </w:r>
-      <w:bookmarkEnd w:id="2"/>
-    </w:p>
-    <w:p>
-      <w:pPr>
-        <w:pStyle w:val="LABHeading2"/>
-      </w:pPr>
-      <w:bookmarkStart w:id="3" w:name="_Toc226987098"/>
-      <w:r>
-        <w:t>First subsection</w:t>
-      </w:r>
-      <w:bookmarkEnd w:id="3"/>
-    </w:p>
-    <w:p>
-      <w:pPr>
-        <w:pStyle w:val="LABnormal"/>
-      </w:pPr>
-      <w:r>
-        <w:t>No introductory text is written between a main section and a subsection; instead, the first subheading should appear immediately below the main heading. However, there must be text below the subheading; in other words, there cannot be three headings in a row. This is sample text for the first subsection. This is sample text for the first subsection. This is sample</w:t>
-      </w:r>
-      <w:r>
-        <w:t xml:space="preserve"> text for the first subsection.</w:t>
-      </w:r>
-    </w:p>
-    <w:p>
-      <w:pPr>
-        <w:pStyle w:val="LABcitation"/>
-        <w:rPr>
-          <w:i w:val="0"/>
-          <w:iCs/>
-        </w:rPr>
-      </w:pPr>
-      <w:r>
-        <w:t xml:space="preserve">This is an example of a direct quote. This is an example of a direct quote. This is an example of a direct quote. This is an example of a direct quote. This is an example of a direct quote. This is an example of a direct quote. </w:t>
-      </w:r>
-      <w:r>
-        <w:rPr>
-          <w:i w:val="0"/>
-        </w:rPr>
-        <w:t>(</w:t>
-      </w:r>
-      <w:r>
-        <w:rPr>
-          <w:i w:val="0"/>
-        </w:rPr>
-        <w:t>Source</w:t>
-      </w:r>
-      <w:r>
-        <w:rPr>
-          <w:i w:val="0"/>
-        </w:rPr>
-        <w:t xml:space="preserve"> 202</w:t>
-      </w:r>
-      <w:r>
-        <w:rPr>
-          <w:i w:val="0"/>
-        </w:rPr>
-        <w:t>6</w:t>
-      </w:r>
-      <w:r>
-        <w:rPr>
-          <w:i w:val="0"/>
-        </w:rPr>
-        <w:t>, 45.)</w:t>
-      </w:r>
-    </w:p>
-    <w:p>
-      <w:pPr>
-        <w:pStyle w:val="LABnormal"/>
-      </w:pPr>
-      <w:r>
-        <w:t>This is sample text for the first subsection. This is sample text for the first subsection. This is sample text for the first subsection. This is sample text for the first subsection. This is sample text for the first subsection.</w:t>
-      </w:r>
-      <w:r>
-        <w:t xml:space="preserve"> This is sample text for the first subsection.</w:t>
-      </w:r>
-    </w:p>
-    <w:p>
-      <w:pPr>
-        <w:pStyle w:val="LABHeading3"/>
-      </w:pPr>
-      <w:bookmarkStart w:id="4" w:name="_Toc226987099"/>
-      <w:r>
-        <w:t>Subsection of first subsection</w:t>
-      </w:r>
-      <w:bookmarkEnd w:id="4"/>
-    </w:p>
-    <w:p>
-      <w:pPr>
-        <w:pStyle w:val="LABnormal"/>
-      </w:pPr>
-      <w:r>
-        <w:t>This is sample text for the subsection of a subsection. This is sample text for the subsection of a subsection. This is sample text for the subsection of a subsection. This is sample text for the subsection of a subsection.</w:t>
-      </w:r>
-      <w:r>
-        <w:t xml:space="preserve"> This is sample text for the subsection of a subsection. This is sample text for the subsection of a subsection.</w:t>
-      </w:r>
-    </w:p>
-    <w:p>
-      <w:pPr>
-        <w:pStyle w:val="LABnormal"/>
-      </w:pPr>
-      <w:r>
-        <w:t>This is sample text for the subsection of a subsection. This is sample text for the subsection of a subsection. This is sample text for the subsection of a subsection. This is sample text for the subsection of a subsection. This is sample text for the subsection of a subsection. This is sample text for the subsection of a subsection.</w:t>
-      </w:r>
-    </w:p>
-    <w:p>
-      <w:pPr>
-        <w:pStyle w:val="LABHeading3"/>
-      </w:pPr>
-      <w:bookmarkStart w:id="5" w:name="_Toc226987100"/>
-      <w:r>
-        <w:t>Second subsection of subsection</w:t>
-      </w:r>
-      <w:bookmarkEnd w:id="5"/>
-    </w:p>
-    <w:p>
-      <w:pPr>
-        <w:pStyle w:val="LABHeading2"/>
-      </w:pPr>
-      <w:bookmarkStart w:id="6" w:name="_Toc226987101"/>
-      <w:r>
-        <w:t>Second subsection</w:t>
-      </w:r>
-      <w:bookmarkEnd w:id="6"/>
-    </w:p>
-    <w:p>
-      <w:pPr>
-        <w:pStyle w:val="LABHeading1"/>
-      </w:pPr>
-      <w:bookmarkStart w:id="7" w:name="_Toc226987102"/>
-      <w:r>
-        <w:lastRenderedPageBreak/>
-        <w:t>Third main section</w:t>
-      </w:r>
-      <w:bookmarkEnd w:id="7"/>
-    </w:p>
-    <w:p>
-      <w:pPr>
-        <w:pStyle w:val="LABHeading2"/>
-      </w:pPr>
-      <w:bookmarkStart w:id="8" w:name="_Toc226987103"/>
-      <w:r>
-        <w:t>First subsection</w:t>
-      </w:r>
-      <w:bookmarkEnd w:id="8"/>
-    </w:p>
-    <w:p>
-      <w:pPr>
-        <w:pStyle w:val="LABnormal"/>
-      </w:pPr>
-      <w:r>
-        <w:t>This is sample text for the subsection of a subsection. This is sample text for the subsection of a subsection. This is sample text for the subsection of a subsection. This is sample text for the subsection of a subsection. This is sample text for the subsection of a subsection. This is sample text for the subsection of a subsection.</w:t>
-      </w:r>
-    </w:p>
-    <w:p>
-      <w:pPr>
-        <w:pStyle w:val="LABnormal"/>
-      </w:pPr>
-      <w:r>
-        <w:t>This is sample text for the subsection of a subsection. This is sample text for the subsection of a subsection. This is sample text for the subsection of a subsection. This is sample text for the subsection of a subsection. This is sample text for the subsection of a subsection. This is sample text for the subsection of a subsection.</w:t>
-      </w:r>
-    </w:p>
-    <w:p>
-      <w:pPr>
-        <w:pStyle w:val="LABHeading2"/>
-      </w:pPr>
-      <w:bookmarkStart w:id="9" w:name="_Toc226987104"/>
-      <w:r>
-        <w:t>Second subsection</w:t>
-      </w:r>
-      <w:bookmarkEnd w:id="9"/>
-    </w:p>
-    <w:p>
-      <w:pPr>
-        <w:pStyle w:val="LABnormal"/>
-      </w:pPr>
-      <w:r>
-        <w:t>This is sample text for the subsection of a subsection. This is sample text for the subsection of a subsection. This is sample text for the subsection of a subsection. This is sample text for the subsection of a subsection. This is sample text for the subsection of a subsection. This is sample text for the subsection of a subsection.</w:t>
-      </w:r>
-    </w:p>
-    <w:p>
-      <w:pPr>
-        <w:pStyle w:val="LABnormal"/>
-      </w:pPr>
-      <w:r>
-        <w:t>This is sample text for the subsection of a subsection. This is sample text for the subsection of a subsection. This is sample text for the subsection of a subsection. This is sample text for the subsection of a subsection. This is sample text for the subsection of a subsection. This is sample text for the subsection of a subsection.</w:t>
-      </w:r>
-    </w:p>
-    <w:p>
-      <w:pPr>
-        <w:pStyle w:val="LABnormal"/>
-      </w:pPr>
-    </w:p>
-    <w:p>
-      <w:pPr>
-        <w:pStyle w:val="LABHeading1"/>
-      </w:pPr>
-      <w:bookmarkStart w:id="10" w:name="_Toc226987105"/>
-      <w:r>
-        <w:lastRenderedPageBreak/>
-        <w:t>Fourth subsection</w:t>
-      </w:r>
-      <w:bookmarkEnd w:id="10"/>
-    </w:p>
-    <w:p>
-      <w:pPr>
-        <w:pStyle w:val="LABHeading2"/>
-      </w:pPr>
-      <w:bookmarkStart w:id="11" w:name="_Toc226987106"/>
-      <w:r>
-        <w:t>First subsection</w:t>
-      </w:r>
-      <w:bookmarkEnd w:id="11"/>
-    </w:p>
-    <w:p>
-      <w:pPr>
-        <w:pStyle w:val="LABHeading2"/>
-      </w:pPr>
-      <w:bookmarkStart w:id="12" w:name="_Toc226987107"/>
-      <w:r>
-        <w:t>Second subsection</w:t>
-      </w:r>
-      <w:bookmarkEnd w:id="12"/>
-    </w:p>
-    <w:p>
-      <w:pPr>
-        <w:pStyle w:val="LABHeading2"/>
-      </w:pPr>
-      <w:bookmarkStart w:id="13" w:name="_Toc226987108"/>
-      <w:r>
-        <w:t>Third subsection</w:t>
-      </w:r>
-      <w:bookmarkEnd w:id="13"/>
-    </w:p>
-    <w:p>
-      <w:pPr>
-        <w:pStyle w:val="LABnormal"/>
-      </w:pPr>
-    </w:p>
-    <w:p>
-      <w:pPr>
-        <w:pStyle w:val="LABHeading1"/>
-      </w:pPr>
-      <w:bookmarkStart w:id="14" w:name="_Toc226987109"/>
-      <w:r>
-        <w:lastRenderedPageBreak/>
-        <w:t>Summary</w:t>
-      </w:r>
-      <w:r>
-        <w:t xml:space="preserve"> and discussion</w:t>
-      </w:r>
-      <w:bookmarkEnd w:id="14"/>
-    </w:p>
-    <w:p>
-      <w:pPr>
-        <w:pStyle w:val="LABnormal"/>
-      </w:pPr>
+        <w:t>As the system was an automatically updating value converter there were no buttons to click to get the output so there are barely any tests to do on the webpage.</w:t>
+      </w:r>
     </w:p>
     <w:p>
       <w:pPr>
         <w:pStyle w:val="LABNon-numberedheading"/>
       </w:pPr>
-      <w:bookmarkStart w:id="15" w:name="_Toc226987110"/>
+      <w:bookmarkStart w:id="4" w:name="_Toc244092271"/>
       <w:r>
         <w:lastRenderedPageBreak/>
         <w:t>References</w:t>
       </w:r>
-      <w:bookmarkEnd w:id="15"/>
+      <w:bookmarkEnd w:id="4"/>
     </w:p>
     <w:p>
       <w:pPr>
         <w:pStyle w:val="LABreferences"/>
-      </w:pPr>
-      <w:r>
-        <w:t xml:space="preserve">Act 123/20XX. </w:t>
-      </w:r>
-    </w:p>
-    <w:p>
-      <w:pPr>
-        <w:pStyle w:val="LABreferences"/>
-        <w:rPr>
-          <w:lang w:val="en-US"/>
-        </w:rPr>
-      </w:pPr>
-      <w:r>
-        <w:rPr>
-          <w:lang w:val="en-US"/>
-        </w:rPr>
-        <w:t xml:space="preserve">Organisation’s name. 2026. </w:t>
-      </w:r>
-      <w:r>
-        <w:rPr>
-          <w:lang w:val="en-US"/>
-        </w:rPr>
-        <w:t xml:space="preserve">Title of the article on the organisation’s website. </w:t>
-      </w:r>
-      <w:r>
-        <w:rPr>
-          <w:lang w:val="en-US"/>
-        </w:rPr>
-        <w:t xml:space="preserve">Retrieved on </w:t>
-      </w:r>
-      <w:r>
-        <w:rPr>
-          <w:lang w:val="en-US"/>
-        </w:rPr>
-        <w:t xml:space="preserve">day month year. </w:t>
-      </w:r>
-      <w:r>
-        <w:rPr>
-          <w:lang w:val="en-US"/>
-        </w:rPr>
-        <w:t xml:space="preserve">Available at </w:t>
-      </w:r>
-      <w:hyperlink r:id="rId13" w:history="1">
+        <w:jc w:val="left"/>
+      </w:pPr>
+      <w:r>
+        <w:t xml:space="preserve">Link to </w:t>
+      </w:r>
+      <w:r>
+        <w:t>GitHub</w:t>
+      </w:r>
+      <w:r>
+        <w:t>:</w:t>
+      </w:r>
+      <w:r>
+        <w:t xml:space="preserve"> </w:t>
+      </w:r>
+      <w:hyperlink r:id="rId16" w:history="1">
         <w:r>
           <w:rPr>
             <w:rStyle w:val="Hyperlink"/>
-            <w:lang w:val="en-US"/>
           </w:rPr>
-          <w:t>https://webaddress</w:t>
+          <w:t>https://github.com/DavinPihlajasaari/Devops_engineering/tree/main/Petri/task-V-GUI-testing</w:t>
         </w:r>
       </w:hyperlink>
     </w:p>
-    <w:p>
-      <w:pPr>
-        <w:pStyle w:val="LABreferences"/>
-        <w:rPr>
-          <w:lang w:val="en-US"/>
-        </w:rPr>
-      </w:pPr>
-      <w:r>
-        <w:rPr>
-          <w:lang w:val="en-US"/>
-        </w:rPr>
-        <w:t xml:space="preserve">Surname, A., Surname, B. &amp; Surname, C. 2022. </w:t>
-      </w:r>
-      <w:r>
-        <w:rPr>
-          <w:lang w:val="en-US"/>
-        </w:rPr>
-        <w:t>Title of book</w:t>
-      </w:r>
-      <w:r>
-        <w:rPr>
-          <w:lang w:val="en-US"/>
-        </w:rPr>
-        <w:t xml:space="preserve">. Location of publisher: Name of publisher. </w:t>
-      </w:r>
-    </w:p>
-    <w:p>
-      <w:pPr>
-        <w:pStyle w:val="LABreferences"/>
-        <w:rPr>
-          <w:lang w:val="en-US"/>
-        </w:rPr>
-      </w:pPr>
-      <w:r>
-        <w:rPr>
-          <w:lang w:val="en-US"/>
-        </w:rPr>
-        <w:t xml:space="preserve">Surname, D. 2023. Title of book. </w:t>
-      </w:r>
-      <w:r>
-        <w:rPr>
-          <w:lang w:val="en-US"/>
-        </w:rPr>
-        <w:t>Audiobook</w:t>
-      </w:r>
-      <w:r>
-        <w:rPr>
-          <w:lang w:val="en-US"/>
-        </w:rPr>
-        <w:t xml:space="preserve">. Location of publisher: Name of publisher. </w:t>
-      </w:r>
-    </w:p>
-    <w:p>
-      <w:pPr>
-        <w:pStyle w:val="LABreferences"/>
-        <w:rPr>
-          <w:lang w:val="en-US"/>
-        </w:rPr>
-      </w:pPr>
-      <w:r>
-        <w:rPr>
-          <w:lang w:val="en-US"/>
-        </w:rPr>
-        <w:t>S</w:t>
-      </w:r>
-      <w:r>
-        <w:rPr>
-          <w:lang w:val="en-US"/>
-        </w:rPr>
-        <w:t>urname</w:t>
-      </w:r>
-      <w:r>
-        <w:rPr>
-          <w:lang w:val="en-US"/>
-        </w:rPr>
-        <w:t>, E. &amp; S</w:t>
-      </w:r>
-      <w:r>
-        <w:rPr>
-          <w:lang w:val="en-US"/>
-        </w:rPr>
-        <w:t>uname</w:t>
-      </w:r>
-      <w:r>
-        <w:rPr>
-          <w:lang w:val="en-US"/>
-        </w:rPr>
-        <w:t xml:space="preserve">, F. 2020. </w:t>
-      </w:r>
-      <w:r>
-        <w:rPr>
-          <w:lang w:val="en-US"/>
-        </w:rPr>
-        <w:t>Title of journal article</w:t>
-      </w:r>
-      <w:r>
-        <w:rPr>
-          <w:lang w:val="en-US"/>
-        </w:rPr>
-        <w:t xml:space="preserve">. </w:t>
-      </w:r>
-      <w:r>
-        <w:rPr>
-          <w:lang w:val="en-US"/>
-        </w:rPr>
-        <w:t xml:space="preserve">Name of journal. </w:t>
-      </w:r>
-      <w:r>
-        <w:rPr>
-          <w:lang w:val="en-US"/>
-        </w:rPr>
-        <w:t>Vol</w:t>
-      </w:r>
-      <w:r>
-        <w:rPr>
-          <w:lang w:val="en-US"/>
-        </w:rPr>
-        <w:t>ume/Issue (e.g., Vol. 13 (8)), page numbers. Available at</w:t>
-      </w:r>
-      <w:r>
-        <w:rPr>
-          <w:lang w:val="en-US"/>
-        </w:rPr>
-        <w:t xml:space="preserve"> DOI </w:t>
-      </w:r>
-      <w:hyperlink r:id="rId14" w:history="1">
-        <w:r>
-          <w:rPr>
-            <w:rStyle w:val="Hyperlink"/>
-            <w:lang w:val="en-US"/>
-          </w:rPr>
-          <w:t>10.3390/jrfm13080166</w:t>
-        </w:r>
-      </w:hyperlink>
-    </w:p>
-    <w:p>
-      <w:pPr>
-        <w:pStyle w:val="LABreferences"/>
-      </w:pPr>
-      <w:r>
-        <w:rPr>
-          <w:lang w:val="en-US"/>
-        </w:rPr>
-        <w:t>Su</w:t>
-      </w:r>
-      <w:r>
-        <w:rPr>
-          <w:lang w:val="en-US"/>
-        </w:rPr>
-        <w:t>rname</w:t>
-      </w:r>
-      <w:r>
-        <w:rPr>
-          <w:lang w:val="en-US"/>
-        </w:rPr>
-        <w:t xml:space="preserve">, G. 2024. </w:t>
-      </w:r>
-      <w:r>
-        <w:rPr>
-          <w:lang w:val="en-US"/>
-        </w:rPr>
-        <w:t>Title of article in a compilation.</w:t>
-      </w:r>
-      <w:r>
-        <w:rPr>
-          <w:lang w:val="en-US"/>
-        </w:rPr>
-        <w:t xml:space="preserve"> In </w:t>
-      </w:r>
-      <w:r>
-        <w:rPr>
-          <w:lang w:val="en-US"/>
-        </w:rPr>
-        <w:t>Su</w:t>
-      </w:r>
-      <w:r>
-        <w:rPr>
-          <w:lang w:val="en-US"/>
-        </w:rPr>
-        <w:t>rname</w:t>
-      </w:r>
-      <w:r>
-        <w:rPr>
-          <w:lang w:val="en-US"/>
-        </w:rPr>
-        <w:t>, H. (</w:t>
-      </w:r>
-      <w:r>
-        <w:rPr>
-          <w:lang w:val="en-US"/>
-        </w:rPr>
-        <w:t>Ed</w:t>
-      </w:r>
-      <w:r>
-        <w:rPr>
-          <w:lang w:val="en-US"/>
-        </w:rPr>
-        <w:t xml:space="preserve">.) </w:t>
-      </w:r>
-      <w:r>
-        <w:rPr>
-          <w:lang w:val="en-US"/>
-        </w:rPr>
-        <w:t>Title of compilation. Location of publisher</w:t>
-      </w:r>
-      <w:r>
-        <w:t xml:space="preserve">: </w:t>
-      </w:r>
-      <w:r>
-        <w:t>Name of publisher, page numbers of the article (e.g., 171-190)</w:t>
-      </w:r>
-      <w:r>
-        <w:t xml:space="preserve">. </w:t>
-      </w:r>
-    </w:p>
-    <w:p>
-      <w:pPr>
-        <w:pStyle w:val="LABreferences"/>
-      </w:pPr>
-      <w:r>
-        <w:t>Title of publication</w:t>
-      </w:r>
-      <w:r>
-        <w:t xml:space="preserve"> 20</w:t>
-      </w:r>
-      <w:r>
-        <w:t>25</w:t>
-      </w:r>
-      <w:r>
-        <w:t xml:space="preserve">. </w:t>
-      </w:r>
-      <w:r>
-        <w:t>Location of publisher:</w:t>
-      </w:r>
-      <w:r>
-        <w:t xml:space="preserve"> </w:t>
-      </w:r>
-      <w:r>
-        <w:t>Name of publisher.</w:t>
-      </w:r>
-    </w:p>
     <w:sectPr>
-      <w:headerReference w:type="default" r:id="rId15"/>
+      <w:headerReference w:type="default" r:id="rId17"/>
       <w:pgSz w:w="11906" w:h="16838"/>
       <w:pgMar w:top="1418" w:right="1418" w:bottom="1418" w:left="1701" w:header="624" w:footer="737" w:gutter="0"/>
       <w:pgNumType w:start="1"/>

</xml_diff>